<commit_message>
Haciendo unos cambios menores en el proyecto
</commit_message>
<xml_diff>
--- a/ProyectoFinalDAWChris.docx
+++ b/ProyectoFinalDAWChris.docx
@@ -119,28 +119,13 @@
         <w:spacing w:after="0"/>
       </w:pPr>
       <w:r>
-        <w:t>Este proyecto consiste en el desarrollo de una web informativa</w:t>
-      </w:r>
-      <w:r>
-        <w:t xml:space="preserve"> enfocada en hablar sobre las franquicias desarrolladas y publicadas por la empresa de Type Moon, compañía que fue fundada por Kinoko Nasu y Takashi Takeuchi</w:t>
-      </w:r>
-      <w:r>
-        <w:t>.</w:t>
-      </w:r>
-      <w:r>
-        <w:t xml:space="preserve"> Dicha empresa se ha encargado de formar un univers</w:t>
-      </w:r>
-      <w:r>
-        <w:t>o repleto</w:t>
-      </w:r>
-      <w:r>
-        <w:t xml:space="preserve"> de escenarios, personajes y conceptos, por lo que se tiene la intención de recopilar lo más importante</w:t>
-      </w:r>
-      <w:r>
-        <w:t xml:space="preserve"> para el disfrute del usuario</w:t>
-      </w:r>
-      <w:r>
-        <w:t>.</w:t>
+        <w:t xml:space="preserve">Este proyecto consiste en el desarrollo de una web informativa enfocada en hablar sobre el manga conocido como “Reincarnation no Kaben” o “Petals of Reincarnation” en inglés, historia escrita e ilustrada por el autor Mikihisa Konishi. Dado que hablamos de una obra </w:t>
+      </w:r>
+      <w:r>
+        <w:t>que es muy poco hablada</w:t>
+      </w:r>
+      <w:r>
+        <w:t>, se tiene la intención de recopilar información importante sobre las facciones, personajes y sus inspiraciones con el mundo real.</w:t>
       </w:r>
     </w:p>
     <w:p>
@@ -161,202 +146,594 @@
         <w:spacing w:after="0"/>
       </w:pPr>
       <w:r>
-        <w:t>Las franquicias hechas por Type Moon son de mis favoritas</w:t>
-      </w:r>
-      <w:r>
-        <w:t xml:space="preserve">, </w:t>
-      </w:r>
-      <w:r>
-        <w:t>lo que hizo interesarme en dedicarle mi tiempo y esfuerzos a la creación de una página web donde pueda hablar de varios temas</w:t>
-      </w:r>
-      <w:r>
-        <w:t xml:space="preserve"> de interés.</w:t>
-      </w:r>
+        <w:t>Reincarnation no Kaben es</w:t>
+      </w:r>
+      <w:r>
+        <w:t xml:space="preserve"> mi </w:t>
+      </w:r>
+      <w:r>
+        <w:t>manga (</w:t>
+      </w:r>
+      <w:r>
+        <w:t>comic japonés</w:t>
+      </w:r>
+      <w:r>
+        <w:t>)</w:t>
+      </w:r>
+      <w:r>
+        <w:t xml:space="preserve"> favorito</w:t>
+      </w:r>
+      <w:r>
+        <w:t>,</w:t>
+      </w:r>
+      <w:r>
+        <w:t xml:space="preserve"> siendo que</w:t>
+      </w:r>
+      <w:r>
+        <w:t xml:space="preserve"> considero que trata temas de lo más interesantes como la reencarnación, la pérdida de la identidad, el</w:t>
+      </w:r>
+      <w:r>
+        <w:t xml:space="preserve"> deseo por querer destacar</w:t>
+      </w:r>
+      <w:r>
+        <w:t xml:space="preserve"> en la vida, </w:t>
+      </w:r>
+      <w:r>
+        <w:t>etc.</w:t>
+      </w:r>
+    </w:p>
+    <w:p>
+      <w:pPr>
+        <w:spacing w:after="0"/>
+      </w:pPr>
+    </w:p>
+    <w:p>
+      <w:pPr>
+        <w:spacing w:after="0"/>
+      </w:pPr>
+      <w:r>
+        <w:t xml:space="preserve">- Contexto del proyecto </w:t>
+      </w:r>
+    </w:p>
+    <w:p>
+      <w:pPr>
+        <w:spacing w:after="0"/>
+      </w:pPr>
+    </w:p>
+    <w:p>
+      <w:pPr>
+        <w:spacing w:after="0"/>
+      </w:pPr>
+      <w:r>
+        <w:t xml:space="preserve">2. FASE DE DEFINICIÓN DEL PROYECTO </w:t>
+      </w:r>
+    </w:p>
+    <w:p>
+      <w:pPr>
+        <w:spacing w:after="0"/>
+      </w:pPr>
+      <w:r>
+        <w:t xml:space="preserve">Según las indicaciones del documento "Pasos de Diseño" entregado: </w:t>
+      </w:r>
+    </w:p>
+    <w:p>
+      <w:pPr>
+        <w:spacing w:after="0"/>
+      </w:pPr>
+      <w:r>
+        <w:t xml:space="preserve">- Análisis de información necesaria </w:t>
+      </w:r>
+    </w:p>
+    <w:p>
+      <w:pPr>
+        <w:spacing w:after="0"/>
+      </w:pPr>
+      <w:r>
+        <w:t xml:space="preserve">- Objetivos del proyecto (generales y específicos) </w:t>
+      </w:r>
+    </w:p>
+    <w:p>
+      <w:pPr>
+        <w:spacing w:after="0"/>
+      </w:pPr>
+      <w:r>
+        <w:t>- Identificación del contenido</w:t>
+      </w:r>
+    </w:p>
+    <w:p>
+      <w:pPr>
+        <w:spacing w:after="0"/>
+      </w:pPr>
+      <w:r>
+        <w:t xml:space="preserve">- Análisis del entorno y competencia </w:t>
+      </w:r>
+    </w:p>
+    <w:p>
+      <w:pPr>
+        <w:spacing w:after="0"/>
+      </w:pPr>
+      <w:r>
+        <w:t xml:space="preserve">- Funcionalidades previstas </w:t>
+      </w:r>
+    </w:p>
+    <w:p>
+      <w:pPr>
+        <w:spacing w:after="0"/>
+      </w:pPr>
+      <w:r>
+        <w:t xml:space="preserve">- Perfil de usuarios/clientes objetivo </w:t>
+      </w:r>
+    </w:p>
+    <w:p>
+      <w:pPr>
+        <w:spacing w:after="0"/>
+      </w:pPr>
+      <w:r>
+        <w:t xml:space="preserve">- Medios de ejecución </w:t>
+      </w:r>
+    </w:p>
+    <w:p>
+      <w:pPr>
+        <w:spacing w:after="0"/>
+      </w:pPr>
+      <w:r>
+        <w:t xml:space="preserve">- Requisitos tecnológicos </w:t>
+      </w:r>
+    </w:p>
+    <w:p>
+      <w:pPr>
+        <w:spacing w:after="0"/>
+      </w:pPr>
+      <w:r>
+        <w:t xml:space="preserve">- Presupuesto estimado </w:t>
+      </w:r>
+    </w:p>
+    <w:p>
+      <w:pPr>
+        <w:spacing w:after="0"/>
+      </w:pPr>
+      <w:r>
+        <w:t xml:space="preserve">- Cronograma de la fase de definición </w:t>
+      </w:r>
+    </w:p>
+    <w:p>
+      <w:pPr>
+        <w:spacing w:after="0"/>
+      </w:pPr>
+    </w:p>
+    <w:p>
+      <w:pPr>
+        <w:spacing w:after="0"/>
+      </w:pPr>
+      <w:r>
+        <w:t xml:space="preserve">3. FASE DE ARQUITECTURA </w:t>
+      </w:r>
+    </w:p>
+    <w:p>
+      <w:pPr>
+        <w:spacing w:after="0"/>
+      </w:pPr>
+      <w:r>
+        <w:t xml:space="preserve">Según las indicaciones del documento "Pasos de Diseño" entregado: </w:t>
+      </w:r>
+    </w:p>
+    <w:p>
+      <w:pPr>
+        <w:spacing w:after="0"/>
+      </w:pPr>
+      <w:r>
+        <w:t xml:space="preserve">- Arquitectura de la información </w:t>
+      </w:r>
+    </w:p>
+    <w:p>
+      <w:pPr>
+        <w:spacing w:after="0"/>
+      </w:pPr>
+      <w:r>
+        <w:t xml:space="preserve">- Estructura del proyecto </w:t>
+      </w:r>
+    </w:p>
+    <w:p>
+      <w:pPr>
+        <w:spacing w:after="0"/>
+      </w:pPr>
+      <w:r>
+        <w:t xml:space="preserve">- Roles y responsabilidades (si es necesario) </w:t>
+      </w:r>
+    </w:p>
+    <w:p>
+      <w:pPr>
+        <w:spacing w:after="0"/>
+      </w:pPr>
+      <w:r>
+        <w:t xml:space="preserve">- Mecanismos de recogida de información </w:t>
+      </w:r>
+    </w:p>
+    <w:p>
+      <w:pPr>
+        <w:spacing w:after="0"/>
+      </w:pPr>
+      <w:r>
+        <w:t xml:space="preserve">- Definición de vínculos entre datos </w:t>
+      </w:r>
+    </w:p>
+    <w:p>
+      <w:pPr>
+        <w:spacing w:after="0"/>
+      </w:pPr>
+      <w:r>
+        <w:t xml:space="preserve">- Recursos necesarios </w:t>
+      </w:r>
+    </w:p>
+    <w:p>
+      <w:pPr>
+        <w:spacing w:after="0"/>
+      </w:pPr>
+      <w:r>
+        <w:lastRenderedPageBreak/>
+        <w:t xml:space="preserve">- Propuesta de diseño/implantación </w:t>
+      </w:r>
+    </w:p>
+    <w:p>
+      <w:pPr>
+        <w:spacing w:after="0"/>
+      </w:pPr>
+      <w:r>
+        <w:t xml:space="preserve">- Prototipos y modelos de organización </w:t>
+      </w:r>
+    </w:p>
+    <w:p>
+      <w:pPr>
+        <w:spacing w:after="0"/>
+      </w:pPr>
+      <w:r>
+        <w:t xml:space="preserve">- Mapa de navegación del sitio web </w:t>
+      </w:r>
+    </w:p>
+    <w:p>
+      <w:pPr>
+        <w:spacing w:after="0"/>
+      </w:pPr>
+      <w:r>
+        <w:t xml:space="preserve">- Plataforma tecnológica adoptada (HTML, CSS, JavaScript, PHP, MySQL, etc.) </w:t>
+      </w:r>
+    </w:p>
+    <w:p>
+      <w:pPr>
+        <w:spacing w:after="0"/>
+      </w:pPr>
+      <w:r>
+        <w:t xml:space="preserve">- Plan de marketing y comunicación (opcional) </w:t>
+      </w:r>
+    </w:p>
+    <w:p>
+      <w:pPr>
+        <w:spacing w:after="0"/>
+      </w:pPr>
+      <w:r>
+        <w:t xml:space="preserve">- Análisis de riesgos </w:t>
+      </w:r>
+    </w:p>
+    <w:p>
+      <w:pPr>
+        <w:spacing w:after="0"/>
+      </w:pPr>
+      <w:r>
+        <w:t>- Normativas y políticas aplicables</w:t>
+      </w:r>
+    </w:p>
+    <w:p>
+      <w:pPr>
+        <w:spacing w:after="0"/>
+      </w:pPr>
+      <w:r>
+        <w:t xml:space="preserve">- Cronograma de la fase de arquitectura </w:t>
+      </w:r>
+    </w:p>
+    <w:p>
+      <w:pPr>
+        <w:spacing w:after="0"/>
+      </w:pPr>
+    </w:p>
+    <w:p>
+      <w:pPr>
+        <w:spacing w:after="0"/>
+      </w:pPr>
+      <w:r>
+        <w:t xml:space="preserve">4. FASE DE DISEÑO </w:t>
+      </w:r>
+    </w:p>
+    <w:p>
+      <w:pPr>
+        <w:spacing w:after="0"/>
+      </w:pPr>
+      <w:r>
+        <w:t xml:space="preserve">Según las indicaciones del documento "Pasos de Diseño" entregado: </w:t>
+      </w:r>
+    </w:p>
+    <w:p>
+      <w:pPr>
+        <w:spacing w:after="0"/>
+      </w:pPr>
+      <w:r>
+        <w:t xml:space="preserve">- Paleta de colores (justificada) </w:t>
+      </w:r>
+    </w:p>
+    <w:p>
+      <w:pPr>
+        <w:spacing w:after="0"/>
+      </w:pPr>
+      <w:r>
+        <w:t xml:space="preserve">- Tipografías seleccionadas </w:t>
+      </w:r>
+    </w:p>
+    <w:p>
+      <w:pPr>
+        <w:spacing w:after="0"/>
+      </w:pPr>
+      <w:r>
+        <w:t xml:space="preserve">- Elementos visuales (imágenes, vídeos, iconos) </w:t>
+      </w:r>
+    </w:p>
+    <w:p>
+      <w:pPr>
+        <w:spacing w:after="0"/>
+      </w:pPr>
+      <w:r>
+        <w:t xml:space="preserve">- Wireframes o bocetos </w:t>
+      </w:r>
+    </w:p>
+    <w:p>
+      <w:pPr>
+        <w:spacing w:after="0"/>
+      </w:pPr>
+      <w:r>
+        <w:t xml:space="preserve">- Mockups o prototipado del diseño final </w:t>
+      </w:r>
+    </w:p>
+    <w:p>
+      <w:pPr>
+        <w:spacing w:after="0"/>
+      </w:pPr>
+      <w:r>
+        <w:t xml:space="preserve">- Guía de estilo </w:t>
+      </w:r>
+    </w:p>
+    <w:p>
+      <w:pPr>
+        <w:spacing w:after="0"/>
+      </w:pPr>
+      <w:r>
+        <w:t>- Análisis de usabilidad</w:t>
+      </w:r>
+    </w:p>
+    <w:p>
+      <w:pPr>
+        <w:spacing w:after="0"/>
+      </w:pPr>
+      <w:r>
+        <w:t xml:space="preserve">- Política de privacidad (si es necesario) </w:t>
+      </w:r>
+    </w:p>
+    <w:p>
+      <w:pPr>
+        <w:spacing w:after="0"/>
+      </w:pPr>
+      <w:r>
+        <w:t>- Roles de diseño (si es necesario)</w:t>
+      </w:r>
+    </w:p>
+    <w:p>
+      <w:pPr>
+        <w:spacing w:after="0"/>
+      </w:pPr>
       <w:r>
         <w:t xml:space="preserve"> </w:t>
       </w:r>
-      <w:r>
-        <w:t xml:space="preserve">Mi intención con el proyecto es explicar </w:t>
-      </w:r>
-      <w:r>
-        <w:t>este universo bajo mi propia interpretación</w:t>
-      </w:r>
-      <w:r>
-        <w:t xml:space="preserve">, utilizando a mi favor </w:t>
-      </w:r>
-      <w:r>
-        <w:t>la extensa investigación que he hecho</w:t>
-      </w:r>
-      <w:r>
-        <w:t xml:space="preserve"> </w:t>
-      </w:r>
-      <w:r>
-        <w:t>con el paso del tiempo</w:t>
-      </w:r>
-      <w:r>
-        <w:t>.</w:t>
-      </w:r>
-      <w:r>
-        <w:t xml:space="preserve"> Y, de se</w:t>
-      </w:r>
-      <w:r>
-        <w:t xml:space="preserve">r posible, quiero que esta web </w:t>
-      </w:r>
-      <w:r>
-        <w:t>sirva de promoción para algunas obras poco conocidas que componen este universo, así como que sirva como impulsora para que aquellos que estén interesados le puedan echar un vistazo.</w:t>
-      </w:r>
-    </w:p>
-    <w:p>
-      <w:pPr>
-        <w:spacing w:after="0"/>
-      </w:pPr>
-    </w:p>
-    <w:p>
-      <w:pPr>
-        <w:spacing w:after="0"/>
-      </w:pPr>
-      <w:r>
-        <w:t xml:space="preserve">- Contexto del proyecto </w:t>
-      </w:r>
-    </w:p>
-    <w:p>
-      <w:pPr>
-        <w:spacing w:after="0"/>
-      </w:pPr>
-      <w:r>
-        <w:t xml:space="preserve">Se le conoce como Nasuverso </w:t>
-      </w:r>
-      <w:r>
-        <w:t>al conjunto de obras publicadas por Type Moon</w:t>
-      </w:r>
-      <w:r>
-        <w:t xml:space="preserve">, este </w:t>
-      </w:r>
-      <w:r>
-        <w:t>pseudónimo</w:t>
-      </w:r>
-      <w:r>
-        <w:t xml:space="preserve"> es </w:t>
-      </w:r>
-      <w:r>
-        <w:t>salido del director y escritor principal de la empresa, Kinoko Nasu</w:t>
-      </w:r>
-      <w:r>
-        <w:t xml:space="preserve">, </w:t>
-      </w:r>
-      <w:r>
-        <w:t xml:space="preserve">siendo una combinación </w:t>
-      </w:r>
-      <w:r>
-        <w:t>su nombre “Nasu” y “Universo”,</w:t>
-      </w:r>
-      <w:r>
-        <w:t xml:space="preserve"> significando, en otras palabras, “El Universo de Nasu”</w:t>
-      </w:r>
-      <w:r>
-        <w:t>.</w:t>
-      </w:r>
-      <w:r>
-        <w:t xml:space="preserve"> Por comodidad se usará este término a lo largo del documento y dentro de la página web.</w:t>
-      </w:r>
-    </w:p>
-    <w:p>
-      <w:pPr>
-        <w:spacing w:after="0"/>
-      </w:pPr>
-    </w:p>
-    <w:p>
-      <w:pPr>
-        <w:spacing w:after="0"/>
-      </w:pPr>
-      <w:r>
-        <w:t xml:space="preserve">El </w:t>
-      </w:r>
-    </w:p>
-    <w:p>
-      <w:pPr>
-        <w:spacing w:after="0"/>
-      </w:pPr>
-    </w:p>
-    <w:p>
-      <w:pPr>
-        <w:spacing w:after="0"/>
-      </w:pPr>
-      <w:r>
-        <w:t xml:space="preserve">2. FASE DE DEFINICIÓN DEL PROYECTO </w:t>
-      </w:r>
-    </w:p>
-    <w:p>
-      <w:pPr>
-        <w:spacing w:after="0"/>
-      </w:pPr>
-      <w:r>
-        <w:t xml:space="preserve">Según las indicaciones del documento "Pasos de Diseño" entregado: </w:t>
-      </w:r>
-    </w:p>
-    <w:p>
-      <w:pPr>
-        <w:spacing w:after="0"/>
-      </w:pPr>
-      <w:r>
-        <w:t xml:space="preserve">- Análisis de información necesaria </w:t>
-      </w:r>
-    </w:p>
-    <w:p>
-      <w:pPr>
-        <w:spacing w:after="0"/>
-      </w:pPr>
-      <w:r>
-        <w:t xml:space="preserve">- Objetivos del proyecto (generales y específicos) </w:t>
-      </w:r>
-    </w:p>
-    <w:p>
-      <w:pPr>
-        <w:spacing w:after="0"/>
-      </w:pPr>
-      <w:r>
-        <w:t>- Identificación del contenido</w:t>
-      </w:r>
-    </w:p>
-    <w:p>
-      <w:pPr>
-        <w:spacing w:after="0"/>
-      </w:pPr>
-      <w:r>
-        <w:t xml:space="preserve">- Análisis del entorno y competencia </w:t>
-      </w:r>
-    </w:p>
-    <w:p>
-      <w:pPr>
-        <w:spacing w:after="0"/>
-      </w:pPr>
-      <w:r>
-        <w:t xml:space="preserve">- Funcionalidades previstas </w:t>
-      </w:r>
-    </w:p>
-    <w:p>
-      <w:pPr>
-        <w:spacing w:after="0"/>
-      </w:pPr>
-      <w:r>
-        <w:t xml:space="preserve">- Perfil de usuarios/clientes objetivo </w:t>
-      </w:r>
-    </w:p>
-    <w:p>
-      <w:pPr>
-        <w:spacing w:after="0"/>
-      </w:pPr>
-      <w:r>
-        <w:t xml:space="preserve">- Medios de ejecución </w:t>
-      </w:r>
-    </w:p>
-    <w:p>
-      <w:pPr>
-        <w:spacing w:after="0"/>
-      </w:pPr>
-      <w:r>
-        <w:t xml:space="preserve">- Requisitos tecnológicos </w:t>
-      </w:r>
+    </w:p>
+    <w:p>
+      <w:pPr>
+        <w:spacing w:after="0"/>
+      </w:pPr>
+      <w:r>
+        <w:t xml:space="preserve">5. MANUAL TÉCNICO </w:t>
+      </w:r>
+    </w:p>
+    <w:p>
+      <w:pPr>
+        <w:spacing w:after="0"/>
+      </w:pPr>
+      <w:r>
+        <w:t xml:space="preserve">- Tecnologías utilizadas (versiones específicas) </w:t>
+      </w:r>
+    </w:p>
+    <w:p>
+      <w:pPr>
+        <w:spacing w:after="0"/>
+      </w:pPr>
+      <w:r>
+        <w:t xml:space="preserve">- Estructura de archivos y directorios del proyecto </w:t>
+      </w:r>
+    </w:p>
+    <w:p>
+      <w:pPr>
+        <w:spacing w:after="0"/>
+      </w:pPr>
+      <w:r>
+        <w:t xml:space="preserve">- Descripción de la base de datos (modelo entidad-relación, tablas, campos) </w:t>
+      </w:r>
+    </w:p>
+    <w:p>
+      <w:pPr>
+        <w:spacing w:after="0"/>
+      </w:pPr>
+      <w:r>
+        <w:t xml:space="preserve">- Descripción de funcionalidades del backend </w:t>
+      </w:r>
+    </w:p>
+    <w:p>
+      <w:pPr>
+        <w:spacing w:after="0"/>
+      </w:pPr>
+      <w:r>
+        <w:t xml:space="preserve">- Descripción de funcionalidades del frontend </w:t>
+      </w:r>
+    </w:p>
+    <w:p>
+      <w:pPr>
+        <w:spacing w:after="0"/>
+      </w:pPr>
+      <w:r>
+        <w:t xml:space="preserve">- APIs utilizadas (si es necesario) </w:t>
+      </w:r>
+    </w:p>
+    <w:p>
+      <w:pPr>
+        <w:spacing w:after="0"/>
+      </w:pPr>
+      <w:r>
+        <w:t xml:space="preserve">- Librerías y frameworks empleados </w:t>
+      </w:r>
+    </w:p>
+    <w:p>
+      <w:pPr>
+        <w:spacing w:after="0"/>
+      </w:pPr>
+    </w:p>
+    <w:p>
+      <w:pPr>
+        <w:spacing w:after="0"/>
+      </w:pPr>
+      <w:r>
+        <w:t xml:space="preserve">6. MANUAL DE USUARIO </w:t>
+      </w:r>
+    </w:p>
+    <w:p>
+      <w:pPr>
+        <w:spacing w:after="0"/>
+      </w:pPr>
+      <w:r>
+        <w:t xml:space="preserve">- Guía paso a paso para utilizar la aplicación </w:t>
+      </w:r>
+    </w:p>
+    <w:p>
+      <w:pPr>
+        <w:spacing w:after="0"/>
+      </w:pPr>
+      <w:r>
+        <w:t xml:space="preserve">- Capturas de pantalla de las principales funcionalidades </w:t>
+      </w:r>
+    </w:p>
+    <w:p>
+      <w:pPr>
+        <w:spacing w:after="0"/>
+      </w:pPr>
+      <w:r>
+        <w:t xml:space="preserve">- Casos de uso comunes </w:t>
+      </w:r>
+    </w:p>
+    <w:p>
+      <w:pPr>
+        <w:spacing w:after="0"/>
+      </w:pPr>
+      <w:r>
+        <w:t xml:space="preserve">- Resolución de problemas frecuentes </w:t>
+      </w:r>
+    </w:p>
+    <w:p>
+      <w:pPr>
+        <w:spacing w:after="0"/>
+      </w:pPr>
+    </w:p>
+    <w:p>
+      <w:pPr>
+        <w:spacing w:after="0"/>
+      </w:pPr>
+      <w:r>
+        <w:t xml:space="preserve">7. CONTROL DE VERSIONES - GIT/GITHUB </w:t>
+      </w:r>
+    </w:p>
+    <w:p>
+      <w:pPr>
+        <w:spacing w:after="0"/>
+      </w:pPr>
+      <w:r>
+        <w:t xml:space="preserve">- Enlace al repositorio de GitHub del proyecto </w:t>
+      </w:r>
+    </w:p>
+    <w:p>
+      <w:pPr>
+        <w:spacing w:after="0"/>
+      </w:pPr>
+      <w:r>
+        <w:t>- Explicación de la estructura de commits realizados</w:t>
+      </w:r>
+    </w:p>
+    <w:p>
+      <w:pPr>
+        <w:spacing w:after="0"/>
+      </w:pPr>
+      <w:r>
+        <w:t xml:space="preserve">- Descripción de las ramas utilizadas (si es necesario) </w:t>
+      </w:r>
+    </w:p>
+    <w:p>
+      <w:pPr>
+        <w:spacing w:after="0"/>
+      </w:pPr>
+      <w:r>
+        <w:t xml:space="preserve">- Capturas de pantalla del historial de commits </w:t>
+      </w:r>
+    </w:p>
+    <w:p>
+      <w:pPr>
+        <w:spacing w:after="0"/>
+      </w:pPr>
+      <w:r>
+        <w:t xml:space="preserve">- Justificación del uso de Git en el desarrollo </w:t>
+      </w:r>
+    </w:p>
+    <w:p>
+      <w:pPr>
+        <w:spacing w:after="0"/>
+      </w:pPr>
+    </w:p>
+    <w:p>
+      <w:pPr>
+        <w:spacing w:after="0"/>
+      </w:pPr>
+      <w:r>
+        <w:t xml:space="preserve">8. TESTING Y PRUEBAS </w:t>
+      </w:r>
+    </w:p>
+    <w:p>
+      <w:pPr>
+        <w:spacing w:after="0"/>
+      </w:pPr>
+      <w:r>
+        <w:t xml:space="preserve">- Pruebas realizadas (funcionales, de usabilidad, de compatibilidad) </w:t>
+      </w:r>
+    </w:p>
+    <w:p>
+      <w:pPr>
+        <w:spacing w:after="0"/>
+      </w:pPr>
+      <w:r>
+        <w:t xml:space="preserve">- Resultados de las pruebas </w:t>
+      </w:r>
+    </w:p>
+    <w:p>
+      <w:pPr>
+        <w:spacing w:after="0"/>
+      </w:pPr>
+      <w:r>
+        <w:t xml:space="preserve">- Correcciones implementadas </w:t>
+      </w:r>
+    </w:p>
+    <w:p>
+      <w:pPr>
+        <w:spacing w:after="0"/>
+      </w:pPr>
     </w:p>
     <w:p>
       <w:pPr>
@@ -364,461 +741,6 @@
       </w:pPr>
       <w:r>
         <w:lastRenderedPageBreak/>
-        <w:t xml:space="preserve">- Presupuesto estimado </w:t>
-      </w:r>
-    </w:p>
-    <w:p>
-      <w:pPr>
-        <w:spacing w:after="0"/>
-      </w:pPr>
-      <w:r>
-        <w:t xml:space="preserve">- Cronograma de la fase de definición </w:t>
-      </w:r>
-    </w:p>
-    <w:p>
-      <w:pPr>
-        <w:spacing w:after="0"/>
-      </w:pPr>
-    </w:p>
-    <w:p>
-      <w:pPr>
-        <w:spacing w:after="0"/>
-      </w:pPr>
-      <w:r>
-        <w:t xml:space="preserve">3. FASE DE ARQUITECTURA </w:t>
-      </w:r>
-    </w:p>
-    <w:p>
-      <w:pPr>
-        <w:spacing w:after="0"/>
-      </w:pPr>
-      <w:r>
-        <w:t xml:space="preserve">Según las indicaciones del documento "Pasos de Diseño" entregado: </w:t>
-      </w:r>
-    </w:p>
-    <w:p>
-      <w:pPr>
-        <w:spacing w:after="0"/>
-      </w:pPr>
-      <w:r>
-        <w:t xml:space="preserve">- Arquitectura de la información </w:t>
-      </w:r>
-    </w:p>
-    <w:p>
-      <w:pPr>
-        <w:spacing w:after="0"/>
-      </w:pPr>
-      <w:r>
-        <w:t xml:space="preserve">- Estructura del proyecto </w:t>
-      </w:r>
-    </w:p>
-    <w:p>
-      <w:pPr>
-        <w:spacing w:after="0"/>
-      </w:pPr>
-      <w:r>
-        <w:t xml:space="preserve">- Roles y responsabilidades (si es necesario) </w:t>
-      </w:r>
-    </w:p>
-    <w:p>
-      <w:pPr>
-        <w:spacing w:after="0"/>
-      </w:pPr>
-      <w:r>
-        <w:t xml:space="preserve">- Mecanismos de recogida de información </w:t>
-      </w:r>
-    </w:p>
-    <w:p>
-      <w:pPr>
-        <w:spacing w:after="0"/>
-      </w:pPr>
-      <w:r>
-        <w:t xml:space="preserve">- Definición de vínculos entre datos </w:t>
-      </w:r>
-    </w:p>
-    <w:p>
-      <w:pPr>
-        <w:spacing w:after="0"/>
-      </w:pPr>
-      <w:r>
-        <w:t xml:space="preserve">- Recursos necesarios </w:t>
-      </w:r>
-    </w:p>
-    <w:p>
-      <w:pPr>
-        <w:spacing w:after="0"/>
-      </w:pPr>
-      <w:r>
-        <w:t xml:space="preserve">- Propuesta de diseño/implantación </w:t>
-      </w:r>
-    </w:p>
-    <w:p>
-      <w:pPr>
-        <w:spacing w:after="0"/>
-      </w:pPr>
-      <w:r>
-        <w:t xml:space="preserve">- Prototipos y modelos de organización </w:t>
-      </w:r>
-    </w:p>
-    <w:p>
-      <w:pPr>
-        <w:spacing w:after="0"/>
-      </w:pPr>
-      <w:r>
-        <w:t xml:space="preserve">- Mapa de navegación del sitio web </w:t>
-      </w:r>
-    </w:p>
-    <w:p>
-      <w:pPr>
-        <w:spacing w:after="0"/>
-      </w:pPr>
-      <w:r>
-        <w:t xml:space="preserve">- Plataforma tecnológica adoptada (HTML, CSS, JavaScript, PHP, MySQL, etc.) </w:t>
-      </w:r>
-    </w:p>
-    <w:p>
-      <w:pPr>
-        <w:spacing w:after="0"/>
-      </w:pPr>
-      <w:r>
-        <w:t xml:space="preserve">- Plan de marketing y comunicación (opcional) </w:t>
-      </w:r>
-    </w:p>
-    <w:p>
-      <w:pPr>
-        <w:spacing w:after="0"/>
-      </w:pPr>
-      <w:r>
-        <w:t xml:space="preserve">- Análisis de riesgos </w:t>
-      </w:r>
-    </w:p>
-    <w:p>
-      <w:pPr>
-        <w:spacing w:after="0"/>
-      </w:pPr>
-      <w:r>
-        <w:t>- Normativas y políticas aplicables</w:t>
-      </w:r>
-    </w:p>
-    <w:p>
-      <w:pPr>
-        <w:spacing w:after="0"/>
-      </w:pPr>
-      <w:r>
-        <w:t xml:space="preserve">- Cronograma de la fase de arquitectura </w:t>
-      </w:r>
-    </w:p>
-    <w:p>
-      <w:pPr>
-        <w:spacing w:after="0"/>
-      </w:pPr>
-    </w:p>
-    <w:p>
-      <w:pPr>
-        <w:spacing w:after="0"/>
-      </w:pPr>
-      <w:r>
-        <w:t xml:space="preserve">4. FASE DE DISEÑO </w:t>
-      </w:r>
-    </w:p>
-    <w:p>
-      <w:pPr>
-        <w:spacing w:after="0"/>
-      </w:pPr>
-      <w:r>
-        <w:t xml:space="preserve">Según las indicaciones del documento "Pasos de Diseño" entregado: </w:t>
-      </w:r>
-    </w:p>
-    <w:p>
-      <w:pPr>
-        <w:spacing w:after="0"/>
-      </w:pPr>
-      <w:r>
-        <w:t xml:space="preserve">- Paleta de colores (justificada) </w:t>
-      </w:r>
-    </w:p>
-    <w:p>
-      <w:pPr>
-        <w:spacing w:after="0"/>
-      </w:pPr>
-      <w:r>
-        <w:t xml:space="preserve">- Tipografías seleccionadas </w:t>
-      </w:r>
-    </w:p>
-    <w:p>
-      <w:pPr>
-        <w:spacing w:after="0"/>
-      </w:pPr>
-      <w:r>
-        <w:t xml:space="preserve">- Elementos visuales (imágenes, vídeos, iconos) </w:t>
-      </w:r>
-    </w:p>
-    <w:p>
-      <w:pPr>
-        <w:spacing w:after="0"/>
-      </w:pPr>
-      <w:r>
-        <w:t xml:space="preserve">- Wireframes o bocetos </w:t>
-      </w:r>
-    </w:p>
-    <w:p>
-      <w:pPr>
-        <w:spacing w:after="0"/>
-      </w:pPr>
-      <w:r>
-        <w:t xml:space="preserve">- Mockups o prototipado del diseño final </w:t>
-      </w:r>
-    </w:p>
-    <w:p>
-      <w:pPr>
-        <w:spacing w:after="0"/>
-      </w:pPr>
-      <w:r>
-        <w:t xml:space="preserve">- Guía de estilo </w:t>
-      </w:r>
-    </w:p>
-    <w:p>
-      <w:pPr>
-        <w:spacing w:after="0"/>
-      </w:pPr>
-      <w:r>
-        <w:t>- Análisis de usabilidad</w:t>
-      </w:r>
-    </w:p>
-    <w:p>
-      <w:pPr>
-        <w:spacing w:after="0"/>
-      </w:pPr>
-      <w:r>
-        <w:t xml:space="preserve">- Política de privacidad (si es necesario) </w:t>
-      </w:r>
-    </w:p>
-    <w:p>
-      <w:pPr>
-        <w:spacing w:after="0"/>
-      </w:pPr>
-      <w:r>
-        <w:t>- Roles de diseño (si es necesario)</w:t>
-      </w:r>
-    </w:p>
-    <w:p>
-      <w:pPr>
-        <w:spacing w:after="0"/>
-      </w:pPr>
-      <w:r>
-        <w:t xml:space="preserve"> </w:t>
-      </w:r>
-    </w:p>
-    <w:p>
-      <w:pPr>
-        <w:spacing w:after="0"/>
-      </w:pPr>
-      <w:r>
-        <w:t xml:space="preserve">5. MANUAL TÉCNICO </w:t>
-      </w:r>
-    </w:p>
-    <w:p>
-      <w:pPr>
-        <w:spacing w:after="0"/>
-      </w:pPr>
-      <w:r>
-        <w:t xml:space="preserve">- Tecnologías utilizadas (versiones específicas) </w:t>
-      </w:r>
-    </w:p>
-    <w:p>
-      <w:pPr>
-        <w:spacing w:after="0"/>
-      </w:pPr>
-      <w:r>
-        <w:t xml:space="preserve">- Estructura de archivos y directorios del proyecto </w:t>
-      </w:r>
-    </w:p>
-    <w:p>
-      <w:pPr>
-        <w:spacing w:after="0"/>
-      </w:pPr>
-      <w:r>
-        <w:t xml:space="preserve">- Descripción de la base de datos (modelo entidad-relación, tablas, campos) </w:t>
-      </w:r>
-    </w:p>
-    <w:p>
-      <w:pPr>
-        <w:spacing w:after="0"/>
-      </w:pPr>
-      <w:r>
-        <w:t xml:space="preserve">- Descripción de funcionalidades del backend </w:t>
-      </w:r>
-    </w:p>
-    <w:p>
-      <w:pPr>
-        <w:spacing w:after="0"/>
-      </w:pPr>
-      <w:r>
-        <w:t xml:space="preserve">- Descripción de funcionalidades del frontend </w:t>
-      </w:r>
-    </w:p>
-    <w:p>
-      <w:pPr>
-        <w:spacing w:after="0"/>
-      </w:pPr>
-      <w:r>
-        <w:t xml:space="preserve">- APIs utilizadas (si es necesario) </w:t>
-      </w:r>
-    </w:p>
-    <w:p>
-      <w:pPr>
-        <w:spacing w:after="0"/>
-      </w:pPr>
-      <w:r>
-        <w:t xml:space="preserve">- Librerías y frameworks empleados </w:t>
-      </w:r>
-    </w:p>
-    <w:p>
-      <w:pPr>
-        <w:spacing w:after="0"/>
-      </w:pPr>
-    </w:p>
-    <w:p>
-      <w:pPr>
-        <w:spacing w:after="0"/>
-      </w:pPr>
-      <w:r>
-        <w:t xml:space="preserve">6. MANUAL DE USUARIO </w:t>
-      </w:r>
-    </w:p>
-    <w:p>
-      <w:pPr>
-        <w:spacing w:after="0"/>
-      </w:pPr>
-      <w:r>
-        <w:t xml:space="preserve">- Guía paso a paso para utilizar la aplicación </w:t>
-      </w:r>
-    </w:p>
-    <w:p>
-      <w:pPr>
-        <w:spacing w:after="0"/>
-      </w:pPr>
-      <w:r>
-        <w:t xml:space="preserve">- Capturas de pantalla de las principales funcionalidades </w:t>
-      </w:r>
-    </w:p>
-    <w:p>
-      <w:pPr>
-        <w:spacing w:after="0"/>
-      </w:pPr>
-      <w:r>
-        <w:t xml:space="preserve">- Casos de uso comunes </w:t>
-      </w:r>
-    </w:p>
-    <w:p>
-      <w:pPr>
-        <w:spacing w:after="0"/>
-      </w:pPr>
-      <w:r>
-        <w:t xml:space="preserve">- Resolución de problemas frecuentes </w:t>
-      </w:r>
-    </w:p>
-    <w:p>
-      <w:pPr>
-        <w:spacing w:after="0"/>
-      </w:pPr>
-    </w:p>
-    <w:p>
-      <w:pPr>
-        <w:spacing w:after="0"/>
-      </w:pPr>
-      <w:r>
-        <w:t xml:space="preserve">7. CONTROL DE VERSIONES - GIT/GITHUB </w:t>
-      </w:r>
-    </w:p>
-    <w:p>
-      <w:pPr>
-        <w:spacing w:after="0"/>
-      </w:pPr>
-      <w:r>
-        <w:lastRenderedPageBreak/>
-        <w:t xml:space="preserve">- Enlace al repositorio de GitHub del proyecto </w:t>
-      </w:r>
-    </w:p>
-    <w:p>
-      <w:pPr>
-        <w:spacing w:after="0"/>
-      </w:pPr>
-      <w:r>
-        <w:t>- Explicación de la estructura de commits realizados</w:t>
-      </w:r>
-    </w:p>
-    <w:p>
-      <w:pPr>
-        <w:spacing w:after="0"/>
-      </w:pPr>
-      <w:r>
-        <w:t xml:space="preserve">- Descripción de las ramas utilizadas (si es necesario) </w:t>
-      </w:r>
-    </w:p>
-    <w:p>
-      <w:pPr>
-        <w:spacing w:after="0"/>
-      </w:pPr>
-      <w:r>
-        <w:t xml:space="preserve">- Capturas de pantalla del historial de commits </w:t>
-      </w:r>
-    </w:p>
-    <w:p>
-      <w:pPr>
-        <w:spacing w:after="0"/>
-      </w:pPr>
-      <w:r>
-        <w:t xml:space="preserve">- Justificación del uso de Git en el desarrollo </w:t>
-      </w:r>
-    </w:p>
-    <w:p>
-      <w:pPr>
-        <w:spacing w:after="0"/>
-      </w:pPr>
-    </w:p>
-    <w:p>
-      <w:pPr>
-        <w:spacing w:after="0"/>
-      </w:pPr>
-      <w:r>
-        <w:t xml:space="preserve">8. TESTING Y PRUEBAS </w:t>
-      </w:r>
-    </w:p>
-    <w:p>
-      <w:pPr>
-        <w:spacing w:after="0"/>
-      </w:pPr>
-      <w:r>
-        <w:t xml:space="preserve">- Pruebas realizadas (funcionales, de usabilidad, de compatibilidad) </w:t>
-      </w:r>
-    </w:p>
-    <w:p>
-      <w:pPr>
-        <w:spacing w:after="0"/>
-      </w:pPr>
-      <w:r>
-        <w:t xml:space="preserve">- Resultados de las pruebas </w:t>
-      </w:r>
-    </w:p>
-    <w:p>
-      <w:pPr>
-        <w:spacing w:after="0"/>
-      </w:pPr>
-      <w:r>
-        <w:t xml:space="preserve">- Correcciones implementadas </w:t>
-      </w:r>
-    </w:p>
-    <w:p>
-      <w:pPr>
-        <w:spacing w:after="0"/>
-      </w:pPr>
-    </w:p>
-    <w:p>
-      <w:pPr>
-        <w:spacing w:after="0"/>
-      </w:pPr>
-      <w:r>
         <w:t xml:space="preserve">9. CONCLUSIONES </w:t>
       </w:r>
     </w:p>

</xml_diff>

<commit_message>
Nuevos menu, video y estilos en el Index
</commit_message>
<xml_diff>
--- a/ProyectoFinalDAWChris.docx
+++ b/ProyectoFinalDAWChris.docx
@@ -119,7 +119,63 @@
         <w:spacing w:after="0"/>
       </w:pPr>
       <w:r>
-        <w:t xml:space="preserve">Este proyecto consiste en el desarrollo de una web informativa enfocada en hablar sobre el manga conocido como “Reincarnation no Kaben” o “Petals of Reincarnation” en inglés, historia escrita e ilustrada por el autor Mikihisa Konishi. Dado que hablamos de una obra </w:t>
+        <w:t>Este proyecto consiste en el desarrollo de una web informativa enfocada en hablar sobre el manga conocido como “</w:t>
+      </w:r>
+      <w:proofErr w:type="spellStart"/>
+      <w:r>
+        <w:t>Reincarnation</w:t>
+      </w:r>
+      <w:proofErr w:type="spellEnd"/>
+      <w:r>
+        <w:t xml:space="preserve"> no </w:t>
+      </w:r>
+      <w:proofErr w:type="spellStart"/>
+      <w:r>
+        <w:t>Kaben</w:t>
+      </w:r>
+      <w:proofErr w:type="spellEnd"/>
+      <w:r>
+        <w:t>” o “</w:t>
+      </w:r>
+      <w:proofErr w:type="spellStart"/>
+      <w:r>
+        <w:t>Petals</w:t>
+      </w:r>
+      <w:proofErr w:type="spellEnd"/>
+      <w:r>
+        <w:t xml:space="preserve"> </w:t>
+      </w:r>
+      <w:proofErr w:type="spellStart"/>
+      <w:r>
+        <w:t>of</w:t>
+      </w:r>
+      <w:proofErr w:type="spellEnd"/>
+      <w:r>
+        <w:t xml:space="preserve"> </w:t>
+      </w:r>
+      <w:proofErr w:type="spellStart"/>
+      <w:r>
+        <w:t>Reincarnation</w:t>
+      </w:r>
+      <w:proofErr w:type="spellEnd"/>
+      <w:r>
+        <w:t xml:space="preserve">” en inglés, historia escrita e ilustrada por el autor </w:t>
+      </w:r>
+      <w:proofErr w:type="spellStart"/>
+      <w:r>
+        <w:t>Mikihisa</w:t>
+      </w:r>
+      <w:proofErr w:type="spellEnd"/>
+      <w:r>
+        <w:t xml:space="preserve"> </w:t>
+      </w:r>
+      <w:proofErr w:type="spellStart"/>
+      <w:r>
+        <w:t>Konishi</w:t>
+      </w:r>
+      <w:proofErr w:type="spellEnd"/>
+      <w:r>
+        <w:t xml:space="preserve">. Dado que hablamos de una obra </w:t>
       </w:r>
       <w:r>
         <w:t>que es muy poco hablada</w:t>
@@ -145,8 +201,21 @@
       <w:pPr>
         <w:spacing w:after="0"/>
       </w:pPr>
-      <w:r>
-        <w:t>Reincarnation no Kaben es</w:t>
+      <w:proofErr w:type="spellStart"/>
+      <w:r>
+        <w:t>Reincarnation</w:t>
+      </w:r>
+      <w:proofErr w:type="spellEnd"/>
+      <w:r>
+        <w:t xml:space="preserve"> no </w:t>
+      </w:r>
+      <w:proofErr w:type="spellStart"/>
+      <w:r>
+        <w:t>Kaben</w:t>
+      </w:r>
+      <w:proofErr w:type="spellEnd"/>
+      <w:r>
+        <w:t xml:space="preserve"> es</w:t>
       </w:r>
       <w:r>
         <w:t xml:space="preserve"> mi </w:t>
@@ -181,18 +250,56 @@
       <w:r>
         <w:t>etc.</w:t>
       </w:r>
-    </w:p>
-    <w:p>
-      <w:pPr>
-        <w:spacing w:after="0"/>
-      </w:pPr>
-    </w:p>
-    <w:p>
-      <w:pPr>
-        <w:spacing w:after="0"/>
-      </w:pPr>
-      <w:r>
-        <w:t xml:space="preserve">- Contexto del proyecto </w:t>
+      <w:r>
+        <w:t xml:space="preserve">, además </w:t>
+      </w:r>
+      <w:r>
+        <w:t xml:space="preserve">de que, como fan de las figuras históricas, ver que éstas son uno de los ejes centrales de la historia hace que </w:t>
+      </w:r>
+      <w:r>
+        <w:t>le tenga todavía más aprecio</w:t>
+      </w:r>
+      <w:r>
+        <w:t>. Como se comentó previamente,</w:t>
+      </w:r>
+      <w:r>
+        <w:t xml:space="preserve"> </w:t>
+      </w:r>
+      <w:r>
+        <w:t xml:space="preserve">este manga, a pesar de que es bastante bueno, </w:t>
+      </w:r>
+      <w:r>
+        <w:t>es poco conocido,</w:t>
+      </w:r>
+      <w:r>
+        <w:t xml:space="preserve"> más allá de una Wikipedia y la página oficial, realmente no hay casi nada de contenido relacionado a éste en internet, por lo que decidí usar mi proyecto como una excusa para promocionarlo y a su vez hablar de </w:t>
+      </w:r>
+      <w:r>
+        <w:t>algo que me gusta bastante.</w:t>
+      </w:r>
+    </w:p>
+    <w:p>
+      <w:pPr>
+        <w:spacing w:after="0"/>
+      </w:pPr>
+    </w:p>
+    <w:p>
+      <w:pPr>
+        <w:spacing w:after="0"/>
+      </w:pPr>
+      <w:r>
+        <w:t>- Contexto del proyecto</w:t>
+      </w:r>
+    </w:p>
+    <w:p>
+      <w:pPr>
+        <w:spacing w:after="0"/>
+      </w:pPr>
+      <w:r>
+        <w:t>La página web pretende abordar</w:t>
+      </w:r>
+      <w:r>
+        <w:t xml:space="preserve"> una sinopsis central de la historia y dedicarse a hablar de las distintas facciones, con un propósito </w:t>
       </w:r>
     </w:p>
     <w:p>
@@ -314,6 +421,7 @@
         <w:spacing w:after="0"/>
       </w:pPr>
       <w:r>
+        <w:lastRenderedPageBreak/>
         <w:t xml:space="preserve">Según las indicaciones del documento "Pasos de Diseño" entregado: </w:t>
       </w:r>
     </w:p>
@@ -370,326 +478,382 @@
         <w:spacing w:after="0"/>
       </w:pPr>
       <w:r>
+        <w:t xml:space="preserve">- Propuesta de diseño/implantación </w:t>
+      </w:r>
+    </w:p>
+    <w:p>
+      <w:pPr>
+        <w:spacing w:after="0"/>
+      </w:pPr>
+      <w:r>
+        <w:t xml:space="preserve">- Prototipos y modelos de organización </w:t>
+      </w:r>
+    </w:p>
+    <w:p>
+      <w:pPr>
+        <w:spacing w:after="0"/>
+      </w:pPr>
+      <w:r>
+        <w:t xml:space="preserve">- Mapa de navegación del sitio web </w:t>
+      </w:r>
+    </w:p>
+    <w:p>
+      <w:pPr>
+        <w:spacing w:after="0"/>
+      </w:pPr>
+      <w:r>
+        <w:t xml:space="preserve">- Plataforma tecnológica adoptada (HTML, CSS, JavaScript, PHP, MySQL, etc.) </w:t>
+      </w:r>
+    </w:p>
+    <w:p>
+      <w:pPr>
+        <w:spacing w:after="0"/>
+      </w:pPr>
+      <w:r>
+        <w:t xml:space="preserve">- Plan de marketing y comunicación (opcional) </w:t>
+      </w:r>
+    </w:p>
+    <w:p>
+      <w:pPr>
+        <w:spacing w:after="0"/>
+      </w:pPr>
+      <w:r>
+        <w:t xml:space="preserve">- Análisis de riesgos </w:t>
+      </w:r>
+    </w:p>
+    <w:p>
+      <w:pPr>
+        <w:spacing w:after="0"/>
+      </w:pPr>
+      <w:r>
+        <w:t>- Normativas y políticas aplicables</w:t>
+      </w:r>
+    </w:p>
+    <w:p>
+      <w:pPr>
+        <w:spacing w:after="0"/>
+      </w:pPr>
+      <w:r>
+        <w:t xml:space="preserve">- Cronograma de la fase de arquitectura </w:t>
+      </w:r>
+    </w:p>
+    <w:p>
+      <w:pPr>
+        <w:spacing w:after="0"/>
+      </w:pPr>
+    </w:p>
+    <w:p>
+      <w:pPr>
+        <w:spacing w:after="0"/>
+      </w:pPr>
+      <w:r>
+        <w:t xml:space="preserve">4. FASE DE DISEÑO </w:t>
+      </w:r>
+    </w:p>
+    <w:p>
+      <w:pPr>
+        <w:spacing w:after="0"/>
+      </w:pPr>
+      <w:r>
+        <w:t xml:space="preserve">Según las indicaciones del documento "Pasos de Diseño" entregado: </w:t>
+      </w:r>
+    </w:p>
+    <w:p>
+      <w:pPr>
+        <w:spacing w:after="0"/>
+      </w:pPr>
+      <w:r>
+        <w:t xml:space="preserve">- Paleta de colores (justificada) </w:t>
+      </w:r>
+    </w:p>
+    <w:p>
+      <w:pPr>
+        <w:spacing w:after="0"/>
+      </w:pPr>
+      <w:r>
+        <w:t xml:space="preserve">- Tipografías seleccionadas </w:t>
+      </w:r>
+    </w:p>
+    <w:p>
+      <w:pPr>
+        <w:spacing w:after="0"/>
+      </w:pPr>
+      <w:r>
+        <w:t xml:space="preserve">- Elementos visuales (imágenes, vídeos, iconos) </w:t>
+      </w:r>
+    </w:p>
+    <w:p>
+      <w:pPr>
+        <w:spacing w:after="0"/>
+      </w:pPr>
+      <w:r>
+        <w:t xml:space="preserve">- </w:t>
+      </w:r>
+      <w:proofErr w:type="spellStart"/>
+      <w:r>
+        <w:t>Wireframes</w:t>
+      </w:r>
+      <w:proofErr w:type="spellEnd"/>
+      <w:r>
+        <w:t xml:space="preserve"> o bocetos </w:t>
+      </w:r>
+    </w:p>
+    <w:p>
+      <w:pPr>
+        <w:spacing w:after="0"/>
+      </w:pPr>
+      <w:r>
+        <w:t xml:space="preserve">- Mockups o prototipado del diseño final </w:t>
+      </w:r>
+    </w:p>
+    <w:p>
+      <w:pPr>
+        <w:spacing w:after="0"/>
+      </w:pPr>
+      <w:r>
+        <w:t xml:space="preserve">- Guía de estilo </w:t>
+      </w:r>
+    </w:p>
+    <w:p>
+      <w:pPr>
+        <w:spacing w:after="0"/>
+      </w:pPr>
+      <w:r>
+        <w:t>- Análisis de usabilidad</w:t>
+      </w:r>
+    </w:p>
+    <w:p>
+      <w:pPr>
+        <w:spacing w:after="0"/>
+      </w:pPr>
+      <w:r>
+        <w:t xml:space="preserve">- Política de privacidad (si es necesario) </w:t>
+      </w:r>
+    </w:p>
+    <w:p>
+      <w:pPr>
+        <w:spacing w:after="0"/>
+      </w:pPr>
+      <w:r>
+        <w:t>- Roles de diseño (si es necesario)</w:t>
+      </w:r>
+    </w:p>
+    <w:p>
+      <w:pPr>
+        <w:spacing w:after="0"/>
+      </w:pPr>
+      <w:r>
+        <w:t xml:space="preserve"> </w:t>
+      </w:r>
+    </w:p>
+    <w:p>
+      <w:pPr>
+        <w:spacing w:after="0"/>
+      </w:pPr>
+      <w:r>
+        <w:t xml:space="preserve">5. MANUAL TÉCNICO </w:t>
+      </w:r>
+    </w:p>
+    <w:p>
+      <w:pPr>
+        <w:spacing w:after="0"/>
+      </w:pPr>
+      <w:r>
+        <w:t xml:space="preserve">- Tecnologías utilizadas (versiones específicas) </w:t>
+      </w:r>
+    </w:p>
+    <w:p>
+      <w:pPr>
+        <w:spacing w:after="0"/>
+      </w:pPr>
+      <w:r>
+        <w:t xml:space="preserve">- Estructura de archivos y directorios del proyecto </w:t>
+      </w:r>
+    </w:p>
+    <w:p>
+      <w:pPr>
+        <w:spacing w:after="0"/>
+      </w:pPr>
+      <w:r>
+        <w:t xml:space="preserve">- Descripción de la base de datos (modelo entidad-relación, tablas, campos) </w:t>
+      </w:r>
+    </w:p>
+    <w:p>
+      <w:pPr>
+        <w:spacing w:after="0"/>
+      </w:pPr>
+      <w:r>
+        <w:t xml:space="preserve">- Descripción de funcionalidades del </w:t>
+      </w:r>
+      <w:proofErr w:type="spellStart"/>
+      <w:r>
+        <w:t>backend</w:t>
+      </w:r>
+      <w:proofErr w:type="spellEnd"/>
+      <w:r>
+        <w:t xml:space="preserve"> </w:t>
+      </w:r>
+    </w:p>
+    <w:p>
+      <w:pPr>
+        <w:spacing w:after="0"/>
+      </w:pPr>
+      <w:r>
+        <w:t xml:space="preserve">- Descripción de funcionalidades del </w:t>
+      </w:r>
+      <w:proofErr w:type="spellStart"/>
+      <w:r>
+        <w:t>frontend</w:t>
+      </w:r>
+      <w:proofErr w:type="spellEnd"/>
+      <w:r>
+        <w:t xml:space="preserve"> </w:t>
+      </w:r>
+    </w:p>
+    <w:p>
+      <w:pPr>
+        <w:spacing w:after="0"/>
+      </w:pPr>
+      <w:r>
+        <w:t xml:space="preserve">- </w:t>
+      </w:r>
+      <w:proofErr w:type="spellStart"/>
+      <w:r>
+        <w:t>APIs</w:t>
+      </w:r>
+      <w:proofErr w:type="spellEnd"/>
+      <w:r>
+        <w:t xml:space="preserve"> utilizadas (si es necesario) </w:t>
+      </w:r>
+    </w:p>
+    <w:p>
+      <w:pPr>
+        <w:spacing w:after="0"/>
+      </w:pPr>
+      <w:r>
+        <w:t xml:space="preserve">- Librerías y </w:t>
+      </w:r>
+      <w:proofErr w:type="spellStart"/>
+      <w:r>
+        <w:t>frameworks</w:t>
+      </w:r>
+      <w:proofErr w:type="spellEnd"/>
+      <w:r>
+        <w:t xml:space="preserve"> empleados </w:t>
+      </w:r>
+    </w:p>
+    <w:p>
+      <w:pPr>
+        <w:spacing w:after="0"/>
+      </w:pPr>
+    </w:p>
+    <w:p>
+      <w:pPr>
+        <w:spacing w:after="0"/>
+      </w:pPr>
+      <w:r>
+        <w:t xml:space="preserve">6. MANUAL DE USUARIO </w:t>
+      </w:r>
+    </w:p>
+    <w:p>
+      <w:pPr>
+        <w:spacing w:after="0"/>
+      </w:pPr>
+      <w:r>
+        <w:t xml:space="preserve">- Guía paso a paso para utilizar la aplicación </w:t>
+      </w:r>
+    </w:p>
+    <w:p>
+      <w:pPr>
+        <w:spacing w:after="0"/>
+      </w:pPr>
+      <w:r>
+        <w:t xml:space="preserve">- Capturas de pantalla de las principales funcionalidades </w:t>
+      </w:r>
+    </w:p>
+    <w:p>
+      <w:pPr>
+        <w:spacing w:after="0"/>
+      </w:pPr>
+      <w:r>
+        <w:t xml:space="preserve">- Casos de uso comunes </w:t>
+      </w:r>
+    </w:p>
+    <w:p>
+      <w:pPr>
+        <w:spacing w:after="0"/>
+      </w:pPr>
+      <w:r>
+        <w:t xml:space="preserve">- Resolución de problemas frecuentes </w:t>
+      </w:r>
+    </w:p>
+    <w:p>
+      <w:pPr>
+        <w:spacing w:after="0"/>
+      </w:pPr>
+    </w:p>
+    <w:p>
+      <w:pPr>
+        <w:spacing w:after="0"/>
+      </w:pPr>
+      <w:r>
+        <w:t xml:space="preserve">7. CONTROL DE VERSIONES - GIT/GITHUB </w:t>
+      </w:r>
+    </w:p>
+    <w:p>
+      <w:pPr>
+        <w:spacing w:after="0"/>
+      </w:pPr>
+      <w:r>
+        <w:t xml:space="preserve">- Enlace al repositorio de GitHub del proyecto </w:t>
+      </w:r>
+    </w:p>
+    <w:p>
+      <w:pPr>
+        <w:spacing w:after="0"/>
+      </w:pPr>
+      <w:r>
+        <w:t xml:space="preserve">- Explicación de la estructura de </w:t>
+      </w:r>
+      <w:proofErr w:type="spellStart"/>
+      <w:r>
+        <w:t>commits</w:t>
+      </w:r>
+      <w:proofErr w:type="spellEnd"/>
+      <w:r>
+        <w:t xml:space="preserve"> realizados</w:t>
+      </w:r>
+    </w:p>
+    <w:p>
+      <w:pPr>
+        <w:spacing w:after="0"/>
+      </w:pPr>
+      <w:r>
+        <w:t xml:space="preserve">- Descripción de las ramas utilizadas (si es necesario) </w:t>
+      </w:r>
+    </w:p>
+    <w:p>
+      <w:pPr>
+        <w:spacing w:after="0"/>
+      </w:pPr>
+      <w:r>
+        <w:t xml:space="preserve">- Capturas de pantalla del historial de </w:t>
+      </w:r>
+      <w:proofErr w:type="spellStart"/>
+      <w:r>
+        <w:t>commits</w:t>
+      </w:r>
+      <w:proofErr w:type="spellEnd"/>
+      <w:r>
+        <w:t xml:space="preserve"> </w:t>
+      </w:r>
+    </w:p>
+    <w:p>
+      <w:pPr>
+        <w:spacing w:after="0"/>
+      </w:pPr>
+      <w:r>
         <w:lastRenderedPageBreak/>
-        <w:t xml:space="preserve">- Propuesta de diseño/implantación </w:t>
-      </w:r>
-    </w:p>
-    <w:p>
-      <w:pPr>
-        <w:spacing w:after="0"/>
-      </w:pPr>
-      <w:r>
-        <w:t xml:space="preserve">- Prototipos y modelos de organización </w:t>
-      </w:r>
-    </w:p>
-    <w:p>
-      <w:pPr>
-        <w:spacing w:after="0"/>
-      </w:pPr>
-      <w:r>
-        <w:t xml:space="preserve">- Mapa de navegación del sitio web </w:t>
-      </w:r>
-    </w:p>
-    <w:p>
-      <w:pPr>
-        <w:spacing w:after="0"/>
-      </w:pPr>
-      <w:r>
-        <w:t xml:space="preserve">- Plataforma tecnológica adoptada (HTML, CSS, JavaScript, PHP, MySQL, etc.) </w:t>
-      </w:r>
-    </w:p>
-    <w:p>
-      <w:pPr>
-        <w:spacing w:after="0"/>
-      </w:pPr>
-      <w:r>
-        <w:t xml:space="preserve">- Plan de marketing y comunicación (opcional) </w:t>
-      </w:r>
-    </w:p>
-    <w:p>
-      <w:pPr>
-        <w:spacing w:after="0"/>
-      </w:pPr>
-      <w:r>
-        <w:t xml:space="preserve">- Análisis de riesgos </w:t>
-      </w:r>
-    </w:p>
-    <w:p>
-      <w:pPr>
-        <w:spacing w:after="0"/>
-      </w:pPr>
-      <w:r>
-        <w:t>- Normativas y políticas aplicables</w:t>
-      </w:r>
-    </w:p>
-    <w:p>
-      <w:pPr>
-        <w:spacing w:after="0"/>
-      </w:pPr>
-      <w:r>
-        <w:t xml:space="preserve">- Cronograma de la fase de arquitectura </w:t>
-      </w:r>
-    </w:p>
-    <w:p>
-      <w:pPr>
-        <w:spacing w:after="0"/>
-      </w:pPr>
-    </w:p>
-    <w:p>
-      <w:pPr>
-        <w:spacing w:after="0"/>
-      </w:pPr>
-      <w:r>
-        <w:t xml:space="preserve">4. FASE DE DISEÑO </w:t>
-      </w:r>
-    </w:p>
-    <w:p>
-      <w:pPr>
-        <w:spacing w:after="0"/>
-      </w:pPr>
-      <w:r>
-        <w:t xml:space="preserve">Según las indicaciones del documento "Pasos de Diseño" entregado: </w:t>
-      </w:r>
-    </w:p>
-    <w:p>
-      <w:pPr>
-        <w:spacing w:after="0"/>
-      </w:pPr>
-      <w:r>
-        <w:t xml:space="preserve">- Paleta de colores (justificada) </w:t>
-      </w:r>
-    </w:p>
-    <w:p>
-      <w:pPr>
-        <w:spacing w:after="0"/>
-      </w:pPr>
-      <w:r>
-        <w:t xml:space="preserve">- Tipografías seleccionadas </w:t>
-      </w:r>
-    </w:p>
-    <w:p>
-      <w:pPr>
-        <w:spacing w:after="0"/>
-      </w:pPr>
-      <w:r>
-        <w:t xml:space="preserve">- Elementos visuales (imágenes, vídeos, iconos) </w:t>
-      </w:r>
-    </w:p>
-    <w:p>
-      <w:pPr>
-        <w:spacing w:after="0"/>
-      </w:pPr>
-      <w:r>
-        <w:t xml:space="preserve">- Wireframes o bocetos </w:t>
-      </w:r>
-    </w:p>
-    <w:p>
-      <w:pPr>
-        <w:spacing w:after="0"/>
-      </w:pPr>
-      <w:r>
-        <w:t xml:space="preserve">- Mockups o prototipado del diseño final </w:t>
-      </w:r>
-    </w:p>
-    <w:p>
-      <w:pPr>
-        <w:spacing w:after="0"/>
-      </w:pPr>
-      <w:r>
-        <w:t xml:space="preserve">- Guía de estilo </w:t>
-      </w:r>
-    </w:p>
-    <w:p>
-      <w:pPr>
-        <w:spacing w:after="0"/>
-      </w:pPr>
-      <w:r>
-        <w:t>- Análisis de usabilidad</w:t>
-      </w:r>
-    </w:p>
-    <w:p>
-      <w:pPr>
-        <w:spacing w:after="0"/>
-      </w:pPr>
-      <w:r>
-        <w:t xml:space="preserve">- Política de privacidad (si es necesario) </w:t>
-      </w:r>
-    </w:p>
-    <w:p>
-      <w:pPr>
-        <w:spacing w:after="0"/>
-      </w:pPr>
-      <w:r>
-        <w:t>- Roles de diseño (si es necesario)</w:t>
-      </w:r>
-    </w:p>
-    <w:p>
-      <w:pPr>
-        <w:spacing w:after="0"/>
-      </w:pPr>
-      <w:r>
-        <w:t xml:space="preserve"> </w:t>
-      </w:r>
-    </w:p>
-    <w:p>
-      <w:pPr>
-        <w:spacing w:after="0"/>
-      </w:pPr>
-      <w:r>
-        <w:t xml:space="preserve">5. MANUAL TÉCNICO </w:t>
-      </w:r>
-    </w:p>
-    <w:p>
-      <w:pPr>
-        <w:spacing w:after="0"/>
-      </w:pPr>
-      <w:r>
-        <w:t xml:space="preserve">- Tecnologías utilizadas (versiones específicas) </w:t>
-      </w:r>
-    </w:p>
-    <w:p>
-      <w:pPr>
-        <w:spacing w:after="0"/>
-      </w:pPr>
-      <w:r>
-        <w:t xml:space="preserve">- Estructura de archivos y directorios del proyecto </w:t>
-      </w:r>
-    </w:p>
-    <w:p>
-      <w:pPr>
-        <w:spacing w:after="0"/>
-      </w:pPr>
-      <w:r>
-        <w:t xml:space="preserve">- Descripción de la base de datos (modelo entidad-relación, tablas, campos) </w:t>
-      </w:r>
-    </w:p>
-    <w:p>
-      <w:pPr>
-        <w:spacing w:after="0"/>
-      </w:pPr>
-      <w:r>
-        <w:t xml:space="preserve">- Descripción de funcionalidades del backend </w:t>
-      </w:r>
-    </w:p>
-    <w:p>
-      <w:pPr>
-        <w:spacing w:after="0"/>
-      </w:pPr>
-      <w:r>
-        <w:t xml:space="preserve">- Descripción de funcionalidades del frontend </w:t>
-      </w:r>
-    </w:p>
-    <w:p>
-      <w:pPr>
-        <w:spacing w:after="0"/>
-      </w:pPr>
-      <w:r>
-        <w:t xml:space="preserve">- APIs utilizadas (si es necesario) </w:t>
-      </w:r>
-    </w:p>
-    <w:p>
-      <w:pPr>
-        <w:spacing w:after="0"/>
-      </w:pPr>
-      <w:r>
-        <w:t xml:space="preserve">- Librerías y frameworks empleados </w:t>
-      </w:r>
-    </w:p>
-    <w:p>
-      <w:pPr>
-        <w:spacing w:after="0"/>
-      </w:pPr>
-    </w:p>
-    <w:p>
-      <w:pPr>
-        <w:spacing w:after="0"/>
-      </w:pPr>
-      <w:r>
-        <w:t xml:space="preserve">6. MANUAL DE USUARIO </w:t>
-      </w:r>
-    </w:p>
-    <w:p>
-      <w:pPr>
-        <w:spacing w:after="0"/>
-      </w:pPr>
-      <w:r>
-        <w:t xml:space="preserve">- Guía paso a paso para utilizar la aplicación </w:t>
-      </w:r>
-    </w:p>
-    <w:p>
-      <w:pPr>
-        <w:spacing w:after="0"/>
-      </w:pPr>
-      <w:r>
-        <w:t xml:space="preserve">- Capturas de pantalla de las principales funcionalidades </w:t>
-      </w:r>
-    </w:p>
-    <w:p>
-      <w:pPr>
-        <w:spacing w:after="0"/>
-      </w:pPr>
-      <w:r>
-        <w:t xml:space="preserve">- Casos de uso comunes </w:t>
-      </w:r>
-    </w:p>
-    <w:p>
-      <w:pPr>
-        <w:spacing w:after="0"/>
-      </w:pPr>
-      <w:r>
-        <w:t xml:space="preserve">- Resolución de problemas frecuentes </w:t>
-      </w:r>
-    </w:p>
-    <w:p>
-      <w:pPr>
-        <w:spacing w:after="0"/>
-      </w:pPr>
-    </w:p>
-    <w:p>
-      <w:pPr>
-        <w:spacing w:after="0"/>
-      </w:pPr>
-      <w:r>
-        <w:t xml:space="preserve">7. CONTROL DE VERSIONES - GIT/GITHUB </w:t>
-      </w:r>
-    </w:p>
-    <w:p>
-      <w:pPr>
-        <w:spacing w:after="0"/>
-      </w:pPr>
-      <w:r>
-        <w:t xml:space="preserve">- Enlace al repositorio de GitHub del proyecto </w:t>
-      </w:r>
-    </w:p>
-    <w:p>
-      <w:pPr>
-        <w:spacing w:after="0"/>
-      </w:pPr>
-      <w:r>
-        <w:t>- Explicación de la estructura de commits realizados</w:t>
-      </w:r>
-    </w:p>
-    <w:p>
-      <w:pPr>
-        <w:spacing w:after="0"/>
-      </w:pPr>
-      <w:r>
-        <w:t xml:space="preserve">- Descripción de las ramas utilizadas (si es necesario) </w:t>
-      </w:r>
-    </w:p>
-    <w:p>
-      <w:pPr>
-        <w:spacing w:after="0"/>
-      </w:pPr>
-      <w:r>
-        <w:t xml:space="preserve">- Capturas de pantalla del historial de commits </w:t>
-      </w:r>
-    </w:p>
-    <w:p>
-      <w:pPr>
-        <w:spacing w:after="0"/>
-      </w:pPr>
-      <w:r>
         <w:t xml:space="preserve">- Justificación del uso de Git en el desarrollo </w:t>
       </w:r>
     </w:p>
@@ -740,7 +904,6 @@
         <w:spacing w:after="0"/>
       </w:pPr>
       <w:r>
-        <w:lastRenderedPageBreak/>
         <w:t xml:space="preserve">9. CONCLUSIONES </w:t>
       </w:r>
     </w:p>

</xml_diff>

<commit_message>
Paleta de colores (word) y algunos cambios hechos
</commit_message>
<xml_diff>
--- a/ProyectoFinalDAWChris.docx
+++ b/ProyectoFinalDAWChris.docx
@@ -119,63 +119,7 @@
         <w:spacing w:after="0"/>
       </w:pPr>
       <w:r>
-        <w:t>Este proyecto consiste en el desarrollo de una web informativa enfocada en hablar sobre el manga conocido como “</w:t>
-      </w:r>
-      <w:proofErr w:type="spellStart"/>
-      <w:r>
-        <w:t>Reincarnation</w:t>
-      </w:r>
-      <w:proofErr w:type="spellEnd"/>
-      <w:r>
-        <w:t xml:space="preserve"> no </w:t>
-      </w:r>
-      <w:proofErr w:type="spellStart"/>
-      <w:r>
-        <w:t>Kaben</w:t>
-      </w:r>
-      <w:proofErr w:type="spellEnd"/>
-      <w:r>
-        <w:t>” o “</w:t>
-      </w:r>
-      <w:proofErr w:type="spellStart"/>
-      <w:r>
-        <w:t>Petals</w:t>
-      </w:r>
-      <w:proofErr w:type="spellEnd"/>
-      <w:r>
-        <w:t xml:space="preserve"> </w:t>
-      </w:r>
-      <w:proofErr w:type="spellStart"/>
-      <w:r>
-        <w:t>of</w:t>
-      </w:r>
-      <w:proofErr w:type="spellEnd"/>
-      <w:r>
-        <w:t xml:space="preserve"> </w:t>
-      </w:r>
-      <w:proofErr w:type="spellStart"/>
-      <w:r>
-        <w:t>Reincarnation</w:t>
-      </w:r>
-      <w:proofErr w:type="spellEnd"/>
-      <w:r>
-        <w:t xml:space="preserve">” en inglés, historia escrita e ilustrada por el autor </w:t>
-      </w:r>
-      <w:proofErr w:type="spellStart"/>
-      <w:r>
-        <w:t>Mikihisa</w:t>
-      </w:r>
-      <w:proofErr w:type="spellEnd"/>
-      <w:r>
-        <w:t xml:space="preserve"> </w:t>
-      </w:r>
-      <w:proofErr w:type="spellStart"/>
-      <w:r>
-        <w:t>Konishi</w:t>
-      </w:r>
-      <w:proofErr w:type="spellEnd"/>
-      <w:r>
-        <w:t xml:space="preserve">. Dado que hablamos de una obra </w:t>
+        <w:t xml:space="preserve">Este proyecto consiste en el desarrollo de una web informativa enfocada en hablar sobre el manga conocido como “Reincarnation no Kaben” o “Petals of Reincarnation” en inglés, historia escrita e ilustrada por el autor Mikihisa Konishi. Dado que hablamos de una obra </w:t>
       </w:r>
       <w:r>
         <w:t>que es muy poco hablada</w:t>
@@ -201,21 +145,8 @@
       <w:pPr>
         <w:spacing w:after="0"/>
       </w:pPr>
-      <w:proofErr w:type="spellStart"/>
-      <w:r>
-        <w:t>Reincarnation</w:t>
-      </w:r>
-      <w:proofErr w:type="spellEnd"/>
-      <w:r>
-        <w:t xml:space="preserve"> no </w:t>
-      </w:r>
-      <w:proofErr w:type="spellStart"/>
-      <w:r>
-        <w:t>Kaben</w:t>
-      </w:r>
-      <w:proofErr w:type="spellEnd"/>
-      <w:r>
-        <w:t xml:space="preserve"> es</w:t>
+      <w:r>
+        <w:t>Reincarnation no Kaben es</w:t>
       </w:r>
       <w:r>
         <w:t xml:space="preserve"> mi </w:t>
@@ -571,6 +502,71 @@
         <w:spacing w:after="0"/>
       </w:pPr>
       <w:r>
+        <w:t>La paleta de colores sele</w:t>
+      </w:r>
+      <w:r>
+        <w:t>ccionada para este proyecto es la que se puede apreciar más abajo, la razón de escogerla es porque estos son los colores que predominan en arte promocional y en las portadas del manga</w:t>
+      </w:r>
+      <w:r>
+        <w:t>, habiendo leves variaciones sobre los mismo</w:t>
+      </w:r>
+      <w:r>
+        <w:t>s.</w:t>
+      </w:r>
+      <w:r>
+        <w:t xml:space="preserve"> </w:t>
+      </w:r>
+    </w:p>
+    <w:p>
+      <w:pPr>
+        <w:spacing w:after="0"/>
+      </w:pPr>
+      <w:r>
+        <w:rPr>
+          <w:noProof/>
+        </w:rPr>
+        <w:drawing>
+          <wp:inline distT="0" distB="0" distL="0" distR="0" wp14:anchorId="3AE522B2" wp14:editId="705019FD">
+            <wp:extent cx="5400040" cy="2625725"/>
+            <wp:effectExtent l="0" t="0" r="0" b="3175"/>
+            <wp:docPr id="1" name="Imagen 1"/>
+            <wp:cNvGraphicFramePr>
+              <a:graphicFrameLocks xmlns:a="http://schemas.openxmlformats.org/drawingml/2006/main" noChangeAspect="1"/>
+            </wp:cNvGraphicFramePr>
+            <a:graphic xmlns:a="http://schemas.openxmlformats.org/drawingml/2006/main">
+              <a:graphicData uri="http://schemas.openxmlformats.org/drawingml/2006/picture">
+                <pic:pic xmlns:pic="http://schemas.openxmlformats.org/drawingml/2006/picture">
+                  <pic:nvPicPr>
+                    <pic:cNvPr id="1" name=""/>
+                    <pic:cNvPicPr/>
+                  </pic:nvPicPr>
+                  <pic:blipFill>
+                    <a:blip r:embed="rId4"/>
+                    <a:stretch>
+                      <a:fillRect/>
+                    </a:stretch>
+                  </pic:blipFill>
+                  <pic:spPr>
+                    <a:xfrm>
+                      <a:off x="0" y="0"/>
+                      <a:ext cx="5400040" cy="2625725"/>
+                    </a:xfrm>
+                    <a:prstGeom prst="rect">
+                      <a:avLst/>
+                    </a:prstGeom>
+                  </pic:spPr>
+                </pic:pic>
+              </a:graphicData>
+            </a:graphic>
+          </wp:inline>
+        </w:drawing>
+      </w:r>
+    </w:p>
+    <w:p>
+      <w:pPr>
+        <w:spacing w:after="0"/>
+      </w:pPr>
+      <w:r>
         <w:t xml:space="preserve">- Tipografías seleccionadas </w:t>
       </w:r>
     </w:p>
@@ -579,6 +575,39 @@
         <w:spacing w:after="0"/>
       </w:pPr>
       <w:r>
+        <w:t xml:space="preserve"> &gt; </w:t>
+      </w:r>
+      <w:r>
+        <w:t>Agency FB</w:t>
+      </w:r>
+      <w:r>
+        <w:t>.</w:t>
+      </w:r>
+    </w:p>
+    <w:p>
+      <w:pPr>
+        <w:spacing w:after="0"/>
+      </w:pPr>
+      <w:r>
+        <w:t>&gt; Times New Roman</w:t>
+      </w:r>
+      <w:r>
+        <w:t>.</w:t>
+      </w:r>
+    </w:p>
+    <w:p>
+      <w:pPr>
+        <w:spacing w:after="0"/>
+      </w:pPr>
+      <w:r>
+        <w:t xml:space="preserve"> </w:t>
+      </w:r>
+    </w:p>
+    <w:p>
+      <w:pPr>
+        <w:spacing w:after="0"/>
+      </w:pPr>
+      <w:r>
         <w:t xml:space="preserve">- Elementos visuales (imágenes, vídeos, iconos) </w:t>
       </w:r>
     </w:p>
@@ -587,15 +616,7 @@
         <w:spacing w:after="0"/>
       </w:pPr>
       <w:r>
-        <w:t xml:space="preserve">- </w:t>
-      </w:r>
-      <w:proofErr w:type="spellStart"/>
-      <w:r>
-        <w:t>Wireframes</w:t>
-      </w:r>
-      <w:proofErr w:type="spellEnd"/>
-      <w:r>
-        <w:t xml:space="preserve"> o bocetos </w:t>
+        <w:t xml:space="preserve">- Wireframes o bocetos </w:t>
       </w:r>
     </w:p>
     <w:p>
@@ -651,6 +672,7 @@
         <w:spacing w:after="0"/>
       </w:pPr>
       <w:r>
+        <w:lastRenderedPageBreak/>
         <w:t xml:space="preserve">5. MANUAL TÉCNICO </w:t>
       </w:r>
     </w:p>
@@ -683,63 +705,31 @@
         <w:spacing w:after="0"/>
       </w:pPr>
       <w:r>
-        <w:t xml:space="preserve">- Descripción de funcionalidades del </w:t>
-      </w:r>
-      <w:proofErr w:type="spellStart"/>
-      <w:r>
-        <w:t>backend</w:t>
-      </w:r>
-      <w:proofErr w:type="spellEnd"/>
-      <w:r>
-        <w:t xml:space="preserve"> </w:t>
-      </w:r>
-    </w:p>
-    <w:p>
-      <w:pPr>
-        <w:spacing w:after="0"/>
-      </w:pPr>
-      <w:r>
-        <w:t xml:space="preserve">- Descripción de funcionalidades del </w:t>
-      </w:r>
-      <w:proofErr w:type="spellStart"/>
-      <w:r>
-        <w:t>frontend</w:t>
-      </w:r>
-      <w:proofErr w:type="spellEnd"/>
-      <w:r>
-        <w:t xml:space="preserve"> </w:t>
-      </w:r>
-    </w:p>
-    <w:p>
-      <w:pPr>
-        <w:spacing w:after="0"/>
-      </w:pPr>
-      <w:r>
-        <w:t xml:space="preserve">- </w:t>
-      </w:r>
-      <w:proofErr w:type="spellStart"/>
-      <w:r>
-        <w:t>APIs</w:t>
-      </w:r>
-      <w:proofErr w:type="spellEnd"/>
-      <w:r>
-        <w:t xml:space="preserve"> utilizadas (si es necesario) </w:t>
-      </w:r>
-    </w:p>
-    <w:p>
-      <w:pPr>
-        <w:spacing w:after="0"/>
-      </w:pPr>
-      <w:r>
-        <w:t xml:space="preserve">- Librerías y </w:t>
-      </w:r>
-      <w:proofErr w:type="spellStart"/>
-      <w:r>
-        <w:t>frameworks</w:t>
-      </w:r>
-      <w:proofErr w:type="spellEnd"/>
-      <w:r>
-        <w:t xml:space="preserve"> empleados </w:t>
+        <w:t xml:space="preserve">- Descripción de funcionalidades del backend </w:t>
+      </w:r>
+    </w:p>
+    <w:p>
+      <w:pPr>
+        <w:spacing w:after="0"/>
+      </w:pPr>
+      <w:r>
+        <w:t xml:space="preserve">- Descripción de funcionalidades del frontend </w:t>
+      </w:r>
+    </w:p>
+    <w:p>
+      <w:pPr>
+        <w:spacing w:after="0"/>
+      </w:pPr>
+      <w:r>
+        <w:t xml:space="preserve">- APIs utilizadas (si es necesario) </w:t>
+      </w:r>
+    </w:p>
+    <w:p>
+      <w:pPr>
+        <w:spacing w:after="0"/>
+      </w:pPr>
+      <w:r>
+        <w:t xml:space="preserve">- Librerías y frameworks empleados </w:t>
       </w:r>
     </w:p>
     <w:p>
@@ -813,15 +803,7 @@
         <w:spacing w:after="0"/>
       </w:pPr>
       <w:r>
-        <w:t xml:space="preserve">- Explicación de la estructura de </w:t>
-      </w:r>
-      <w:proofErr w:type="spellStart"/>
-      <w:r>
-        <w:t>commits</w:t>
-      </w:r>
-      <w:proofErr w:type="spellEnd"/>
-      <w:r>
-        <w:t xml:space="preserve"> realizados</w:t>
+        <w:t>- Explicación de la estructura de commits realizados</w:t>
       </w:r>
     </w:p>
     <w:p>
@@ -837,23 +819,14 @@
         <w:spacing w:after="0"/>
       </w:pPr>
       <w:r>
-        <w:t xml:space="preserve">- Capturas de pantalla del historial de </w:t>
-      </w:r>
-      <w:proofErr w:type="spellStart"/>
-      <w:r>
-        <w:t>commits</w:t>
-      </w:r>
-      <w:proofErr w:type="spellEnd"/>
-      <w:r>
-        <w:t xml:space="preserve"> </w:t>
-      </w:r>
-    </w:p>
-    <w:p>
-      <w:pPr>
-        <w:spacing w:after="0"/>
-      </w:pPr>
-      <w:r>
-        <w:lastRenderedPageBreak/>
+        <w:t xml:space="preserve">- Capturas de pantalla del historial de commits </w:t>
+      </w:r>
+    </w:p>
+    <w:p>
+      <w:pPr>
+        <w:spacing w:after="0"/>
+      </w:pPr>
+      <w:r>
         <w:t xml:space="preserve">- Justificación del uso de Git en el desarrollo </w:t>
       </w:r>
     </w:p>

</xml_diff>

<commit_message>
Haciendo algunos cambios menores en la web
</commit_message>
<xml_diff>
--- a/ProyectoFinalDAWChris.docx
+++ b/ProyectoFinalDAWChris.docx
@@ -3,15 +3,29 @@
 <w:document xmlns:wpc="http://schemas.microsoft.com/office/word/2010/wordprocessingCanvas" xmlns:cx="http://schemas.microsoft.com/office/drawing/2014/chartex" xmlns:cx1="http://schemas.microsoft.com/office/drawing/2015/9/8/chartex" xmlns:cx2="http://schemas.microsoft.com/office/drawing/2015/10/21/chartex" xmlns:cx3="http://schemas.microsoft.com/office/drawing/2016/5/9/chartex" xmlns:cx4="http://schemas.microsoft.com/office/drawing/2016/5/10/chartex" xmlns:cx5="http://schemas.microsoft.com/office/drawing/2016/5/11/chartex" xmlns:cx6="http://schemas.microsoft.com/office/drawing/2016/5/12/chartex" xmlns:cx7="http://schemas.microsoft.com/office/drawing/2016/5/13/chartex" xmlns:cx8="http://schemas.microsoft.com/office/drawing/2016/5/14/chartex" xmlns:mc="http://schemas.openxmlformats.org/markup-compatibility/2006" xmlns:aink="http://schemas.microsoft.com/office/drawing/2016/ink" xmlns:am3d="http://schemas.microsoft.com/office/drawing/2017/model3d" xmlns:o="urn:schemas-microsoft-com:office:office" xmlns:oel="http://schemas.microsoft.com/office/2019/extlst" xmlns:r="http://schemas.openxmlformats.org/officeDocument/2006/relationships" xmlns:m="http://schemas.openxmlformats.org/officeDocument/2006/math" xmlns:v="urn:schemas-microsoft-com:vml" xmlns:wp14="http://schemas.microsoft.com/office/word/2010/wordprocessingDrawing" xmlns:wp="http://schemas.openxmlformats.org/drawingml/2006/wordprocessingDrawing" xmlns:w10="urn:schemas-microsoft-com:office:word" xmlns:w="http://schemas.openxmlformats.org/wordprocessingml/2006/main" xmlns:w14="http://schemas.microsoft.com/office/word/2010/wordml" xmlns:w15="http://schemas.microsoft.com/office/word/2012/wordml" xmlns:w16cex="http://schemas.microsoft.com/office/word/2018/wordml/cex" xmlns:w16cid="http://schemas.microsoft.com/office/word/2016/wordml/cid" xmlns:w16="http://schemas.microsoft.com/office/word/2018/wordml" xmlns:w16sdtdh="http://schemas.microsoft.com/office/word/2020/wordml/sdtdatahash" xmlns:w16se="http://schemas.microsoft.com/office/word/2015/wordml/symex" xmlns:wpg="http://schemas.microsoft.com/office/word/2010/wordprocessingGroup" xmlns:wpi="http://schemas.microsoft.com/office/word/2010/wordprocessingInk" xmlns:wne="http://schemas.microsoft.com/office/word/2006/wordml" xmlns:wps="http://schemas.microsoft.com/office/word/2010/wordprocessingShape" mc:Ignorable="w14 w15 w16se w16cid w16 w16cex w16sdtdh wp14">
   <w:body>
     <w:p>
-      <w:r>
+      <w:pPr>
+        <w:rPr>
+          <w:rFonts w:ascii="Verdana" w:hAnsi="Verdana"/>
+        </w:rPr>
+      </w:pPr>
+      <w:r>
+        <w:rPr>
+          <w:rFonts w:ascii="Verdana" w:hAnsi="Verdana"/>
+        </w:rPr>
         <w:br w:type="page"/>
       </w:r>
     </w:p>
     <w:p>
       <w:pPr>
         <w:spacing w:after="0"/>
-      </w:pPr>
-      <w:r>
+        <w:rPr>
+          <w:rFonts w:ascii="Verdana" w:hAnsi="Verdana"/>
+        </w:rPr>
+      </w:pPr>
+      <w:r>
+        <w:rPr>
+          <w:rFonts w:ascii="Verdana" w:hAnsi="Verdana"/>
+        </w:rPr>
         <w:lastRenderedPageBreak/>
         <w:t xml:space="preserve">PORTADA </w:t>
       </w:r>
@@ -19,88 +33,148 @@
     <w:p>
       <w:pPr>
         <w:spacing w:after="0"/>
-      </w:pPr>
-      <w:r>
+        <w:rPr>
+          <w:rFonts w:ascii="Verdana" w:hAnsi="Verdana"/>
+        </w:rPr>
+      </w:pPr>
+      <w:r>
+        <w:rPr>
+          <w:rFonts w:ascii="Verdana" w:hAnsi="Verdana"/>
+        </w:rPr>
         <w:t xml:space="preserve">- Título del proyecto </w:t>
       </w:r>
     </w:p>
     <w:p>
       <w:pPr>
         <w:spacing w:after="0"/>
-      </w:pPr>
-      <w:r>
+        <w:rPr>
+          <w:rFonts w:ascii="Verdana" w:hAnsi="Verdana"/>
+        </w:rPr>
+      </w:pPr>
+      <w:r>
+        <w:rPr>
+          <w:rFonts w:ascii="Verdana" w:hAnsi="Verdana"/>
+        </w:rPr>
         <w:t xml:space="preserve">- Nombre completo del alumno/a </w:t>
       </w:r>
     </w:p>
     <w:p>
       <w:pPr>
         <w:spacing w:after="0"/>
-      </w:pPr>
-      <w:r>
+        <w:rPr>
+          <w:rFonts w:ascii="Verdana" w:hAnsi="Verdana"/>
+        </w:rPr>
+      </w:pPr>
+      <w:r>
+        <w:rPr>
+          <w:rFonts w:ascii="Verdana" w:hAnsi="Verdana"/>
+        </w:rPr>
         <w:t xml:space="preserve">- Curso y año académico </w:t>
       </w:r>
     </w:p>
     <w:p>
       <w:pPr>
         <w:spacing w:after="0"/>
-      </w:pPr>
-      <w:r>
+        <w:rPr>
+          <w:rFonts w:ascii="Verdana" w:hAnsi="Verdana"/>
+        </w:rPr>
+      </w:pPr>
+      <w:r>
+        <w:rPr>
+          <w:rFonts w:ascii="Verdana" w:hAnsi="Verdana"/>
+        </w:rPr>
         <w:t xml:space="preserve">- Nombre del ciclo formativo </w:t>
       </w:r>
     </w:p>
     <w:p>
       <w:pPr>
         <w:spacing w:after="0"/>
-      </w:pPr>
-      <w:r>
+        <w:rPr>
+          <w:rFonts w:ascii="Verdana" w:hAnsi="Verdana"/>
+        </w:rPr>
+      </w:pPr>
+      <w:r>
+        <w:rPr>
+          <w:rFonts w:ascii="Verdana" w:hAnsi="Verdana"/>
+        </w:rPr>
         <w:t xml:space="preserve">- Nombre del centro educativo </w:t>
       </w:r>
     </w:p>
     <w:p>
       <w:pPr>
         <w:spacing w:after="0"/>
-      </w:pPr>
-      <w:r>
+        <w:rPr>
+          <w:rFonts w:ascii="Verdana" w:hAnsi="Verdana"/>
+        </w:rPr>
+      </w:pPr>
+      <w:r>
+        <w:rPr>
+          <w:rFonts w:ascii="Verdana" w:hAnsi="Verdana"/>
+        </w:rPr>
         <w:t xml:space="preserve">- Fecha de entrega </w:t>
       </w:r>
     </w:p>
     <w:p>
       <w:pPr>
         <w:spacing w:after="0"/>
-      </w:pPr>
-    </w:p>
-    <w:p>
-      <w:pPr>
-        <w:spacing w:after="0"/>
-      </w:pPr>
-      <w:r>
+        <w:rPr>
+          <w:rFonts w:ascii="Verdana" w:hAnsi="Verdana"/>
+        </w:rPr>
+      </w:pPr>
+    </w:p>
+    <w:p>
+      <w:pPr>
+        <w:spacing w:after="0"/>
+        <w:rPr>
+          <w:rFonts w:ascii="Verdana" w:hAnsi="Verdana"/>
+        </w:rPr>
+      </w:pPr>
+      <w:r>
+        <w:rPr>
+          <w:rFonts w:ascii="Verdana" w:hAnsi="Verdana"/>
+        </w:rPr>
         <w:t>ÍNDICE</w:t>
       </w:r>
     </w:p>
     <w:p>
       <w:pPr>
         <w:spacing w:after="0"/>
-      </w:pPr>
-      <w:r>
+        <w:rPr>
+          <w:rFonts w:ascii="Verdana" w:hAnsi="Verdana"/>
+        </w:rPr>
+      </w:pPr>
+      <w:r>
+        <w:rPr>
+          <w:rFonts w:ascii="Verdana" w:hAnsi="Verdana"/>
+        </w:rPr>
         <w:t>- Numeración de todas las secciones y subsecciones</w:t>
       </w:r>
     </w:p>
     <w:p>
       <w:pPr>
         <w:spacing w:after="0"/>
-      </w:pPr>
-      <w:r>
+        <w:rPr>
+          <w:rFonts w:ascii="Verdana" w:hAnsi="Verdana"/>
+        </w:rPr>
+      </w:pPr>
+      <w:r>
+        <w:rPr>
+          <w:rFonts w:ascii="Verdana" w:hAnsi="Verdana"/>
+        </w:rPr>
         <w:t xml:space="preserve">- Paginación correcta </w:t>
       </w:r>
     </w:p>
     <w:p>
       <w:pPr>
         <w:spacing w:after="0"/>
-      </w:pPr>
-    </w:p>
-    <w:p>
-      <w:pPr>
-        <w:spacing w:after="0"/>
+        <w:rPr>
+          <w:rFonts w:ascii="Verdana" w:hAnsi="Verdana"/>
+        </w:rPr>
+      </w:pPr>
+    </w:p>
+    <w:p>
+      <w:pPr>
+        <w:pStyle w:val="Ttulo1"/>
       </w:pPr>
       <w:r>
         <w:t xml:space="preserve">1. INTRODUCCIÓN </w:t>
@@ -108,139 +182,373 @@
     </w:p>
     <w:p>
       <w:pPr>
-        <w:spacing w:after="0"/>
-      </w:pPr>
-      <w:r>
+        <w:pStyle w:val="Ttulo2"/>
+        <w:rPr>
+          <w:rFonts w:ascii="Verdana" w:hAnsi="Verdana"/>
+        </w:rPr>
+      </w:pPr>
+      <w:r>
+        <w:rPr>
+          <w:rFonts w:ascii="Verdana" w:hAnsi="Verdana"/>
+        </w:rPr>
         <w:t xml:space="preserve">- Presentación del proyecto </w:t>
       </w:r>
     </w:p>
     <w:p>
       <w:pPr>
         <w:spacing w:after="0"/>
-      </w:pPr>
-      <w:r>
-        <w:t xml:space="preserve">Este proyecto consiste en el desarrollo de una web informativa enfocada en hablar sobre el manga conocido como “Reincarnation no Kaben” o “Petals of Reincarnation” en inglés, historia escrita e ilustrada por el autor Mikihisa Konishi. Dado que hablamos de una obra </w:t>
-      </w:r>
-      <w:r>
+        <w:rPr>
+          <w:rFonts w:ascii="Verdana" w:hAnsi="Verdana"/>
+        </w:rPr>
+      </w:pPr>
+      <w:r>
+        <w:rPr>
+          <w:rFonts w:ascii="Verdana" w:hAnsi="Verdana"/>
+        </w:rPr>
+        <w:t>Este proyecto consiste en el desarrollo de una web informativa enfocada en hablar sobre el manga conocido como “</w:t>
+      </w:r>
+      <w:proofErr w:type="spellStart"/>
+      <w:r>
+        <w:rPr>
+          <w:rFonts w:ascii="Verdana" w:hAnsi="Verdana"/>
+        </w:rPr>
+        <w:t>Reincarnation</w:t>
+      </w:r>
+      <w:proofErr w:type="spellEnd"/>
+      <w:r>
+        <w:rPr>
+          <w:rFonts w:ascii="Verdana" w:hAnsi="Verdana"/>
+        </w:rPr>
+        <w:t xml:space="preserve"> no </w:t>
+      </w:r>
+      <w:proofErr w:type="spellStart"/>
+      <w:r>
+        <w:rPr>
+          <w:rFonts w:ascii="Verdana" w:hAnsi="Verdana"/>
+        </w:rPr>
+        <w:t>Kaben</w:t>
+      </w:r>
+      <w:proofErr w:type="spellEnd"/>
+      <w:r>
+        <w:rPr>
+          <w:rFonts w:ascii="Verdana" w:hAnsi="Verdana"/>
+        </w:rPr>
+        <w:t>” o “</w:t>
+      </w:r>
+      <w:proofErr w:type="spellStart"/>
+      <w:r>
+        <w:rPr>
+          <w:rFonts w:ascii="Verdana" w:hAnsi="Verdana"/>
+        </w:rPr>
+        <w:t>Petals</w:t>
+      </w:r>
+      <w:proofErr w:type="spellEnd"/>
+      <w:r>
+        <w:rPr>
+          <w:rFonts w:ascii="Verdana" w:hAnsi="Verdana"/>
+        </w:rPr>
+        <w:t xml:space="preserve"> </w:t>
+      </w:r>
+      <w:proofErr w:type="spellStart"/>
+      <w:r>
+        <w:rPr>
+          <w:rFonts w:ascii="Verdana" w:hAnsi="Verdana"/>
+        </w:rPr>
+        <w:t>of</w:t>
+      </w:r>
+      <w:proofErr w:type="spellEnd"/>
+      <w:r>
+        <w:rPr>
+          <w:rFonts w:ascii="Verdana" w:hAnsi="Verdana"/>
+        </w:rPr>
+        <w:t xml:space="preserve"> </w:t>
+      </w:r>
+      <w:proofErr w:type="spellStart"/>
+      <w:r>
+        <w:rPr>
+          <w:rFonts w:ascii="Verdana" w:hAnsi="Verdana"/>
+        </w:rPr>
+        <w:t>Reincarnation</w:t>
+      </w:r>
+      <w:proofErr w:type="spellEnd"/>
+      <w:r>
+        <w:rPr>
+          <w:rFonts w:ascii="Verdana" w:hAnsi="Verdana"/>
+        </w:rPr>
+        <w:t xml:space="preserve">” en inglés, historia escrita e ilustrada por el autor </w:t>
+      </w:r>
+      <w:proofErr w:type="spellStart"/>
+      <w:r>
+        <w:rPr>
+          <w:rFonts w:ascii="Verdana" w:hAnsi="Verdana"/>
+        </w:rPr>
+        <w:t>Mikihisa</w:t>
+      </w:r>
+      <w:proofErr w:type="spellEnd"/>
+      <w:r>
+        <w:rPr>
+          <w:rFonts w:ascii="Verdana" w:hAnsi="Verdana"/>
+        </w:rPr>
+        <w:t xml:space="preserve"> </w:t>
+      </w:r>
+      <w:proofErr w:type="spellStart"/>
+      <w:r>
+        <w:rPr>
+          <w:rFonts w:ascii="Verdana" w:hAnsi="Verdana"/>
+        </w:rPr>
+        <w:t>Konishi</w:t>
+      </w:r>
+      <w:proofErr w:type="spellEnd"/>
+      <w:r>
+        <w:rPr>
+          <w:rFonts w:ascii="Verdana" w:hAnsi="Verdana"/>
+        </w:rPr>
+        <w:t xml:space="preserve">. Dado que hablamos de una obra </w:t>
+      </w:r>
+      <w:r>
+        <w:rPr>
+          <w:rFonts w:ascii="Verdana" w:hAnsi="Verdana"/>
+        </w:rPr>
         <w:t>que es muy poco hablada</w:t>
       </w:r>
       <w:r>
+        <w:rPr>
+          <w:rFonts w:ascii="Verdana" w:hAnsi="Verdana"/>
+        </w:rPr>
         <w:t>, se tiene la intención de recopilar información importante sobre las facciones, personajes y sus inspiraciones con el mundo real.</w:t>
       </w:r>
     </w:p>
     <w:p>
       <w:pPr>
         <w:spacing w:after="0"/>
-      </w:pPr>
-    </w:p>
-    <w:p>
-      <w:pPr>
-        <w:spacing w:after="0"/>
-      </w:pPr>
-      <w:r>
+        <w:rPr>
+          <w:rFonts w:ascii="Verdana" w:hAnsi="Verdana"/>
+        </w:rPr>
+      </w:pPr>
+    </w:p>
+    <w:p>
+      <w:pPr>
+        <w:pStyle w:val="Ttulo2"/>
+        <w:rPr>
+          <w:rFonts w:ascii="Verdana" w:hAnsi="Verdana"/>
+        </w:rPr>
+      </w:pPr>
+      <w:r>
+        <w:rPr>
+          <w:rFonts w:ascii="Verdana" w:hAnsi="Verdana"/>
+        </w:rPr>
         <w:t xml:space="preserve">- Motivación y justificación </w:t>
       </w:r>
     </w:p>
     <w:p>
       <w:pPr>
         <w:spacing w:after="0"/>
-      </w:pPr>
-      <w:r>
-        <w:t>Reincarnation no Kaben es</w:t>
-      </w:r>
-      <w:r>
+        <w:rPr>
+          <w:rFonts w:ascii="Verdana" w:hAnsi="Verdana"/>
+        </w:rPr>
+      </w:pPr>
+      <w:proofErr w:type="spellStart"/>
+      <w:r>
+        <w:rPr>
+          <w:rFonts w:ascii="Verdana" w:hAnsi="Verdana"/>
+        </w:rPr>
+        <w:t>Reincarnation</w:t>
+      </w:r>
+      <w:proofErr w:type="spellEnd"/>
+      <w:r>
+        <w:rPr>
+          <w:rFonts w:ascii="Verdana" w:hAnsi="Verdana"/>
+        </w:rPr>
+        <w:t xml:space="preserve"> no </w:t>
+      </w:r>
+      <w:proofErr w:type="spellStart"/>
+      <w:r>
+        <w:rPr>
+          <w:rFonts w:ascii="Verdana" w:hAnsi="Verdana"/>
+        </w:rPr>
+        <w:t>Kaben</w:t>
+      </w:r>
+      <w:proofErr w:type="spellEnd"/>
+      <w:r>
+        <w:rPr>
+          <w:rFonts w:ascii="Verdana" w:hAnsi="Verdana"/>
+        </w:rPr>
+        <w:t xml:space="preserve"> es</w:t>
+      </w:r>
+      <w:r>
+        <w:rPr>
+          <w:rFonts w:ascii="Verdana" w:hAnsi="Verdana"/>
+        </w:rPr>
         <w:t xml:space="preserve"> mi </w:t>
       </w:r>
       <w:r>
+        <w:rPr>
+          <w:rFonts w:ascii="Verdana" w:hAnsi="Verdana"/>
+        </w:rPr>
         <w:t>manga (</w:t>
       </w:r>
       <w:r>
+        <w:rPr>
+          <w:rFonts w:ascii="Verdana" w:hAnsi="Verdana"/>
+        </w:rPr>
         <w:t>comic japonés</w:t>
       </w:r>
       <w:r>
+        <w:rPr>
+          <w:rFonts w:ascii="Verdana" w:hAnsi="Verdana"/>
+        </w:rPr>
         <w:t>)</w:t>
       </w:r>
       <w:r>
+        <w:rPr>
+          <w:rFonts w:ascii="Verdana" w:hAnsi="Verdana"/>
+        </w:rPr>
         <w:t xml:space="preserve"> favorito</w:t>
       </w:r>
       <w:r>
+        <w:rPr>
+          <w:rFonts w:ascii="Verdana" w:hAnsi="Verdana"/>
+        </w:rPr>
         <w:t>,</w:t>
       </w:r>
       <w:r>
+        <w:rPr>
+          <w:rFonts w:ascii="Verdana" w:hAnsi="Verdana"/>
+        </w:rPr>
         <w:t xml:space="preserve"> siendo que</w:t>
       </w:r>
       <w:r>
+        <w:rPr>
+          <w:rFonts w:ascii="Verdana" w:hAnsi="Verdana"/>
+        </w:rPr>
         <w:t xml:space="preserve"> considero que trata temas de lo más interesantes como la reencarnación, la pérdida de la identidad, el</w:t>
       </w:r>
       <w:r>
+        <w:rPr>
+          <w:rFonts w:ascii="Verdana" w:hAnsi="Verdana"/>
+        </w:rPr>
         <w:t xml:space="preserve"> deseo por querer destacar</w:t>
       </w:r>
       <w:r>
+        <w:rPr>
+          <w:rFonts w:ascii="Verdana" w:hAnsi="Verdana"/>
+        </w:rPr>
         <w:t xml:space="preserve"> en la vida, </w:t>
       </w:r>
       <w:r>
+        <w:rPr>
+          <w:rFonts w:ascii="Verdana" w:hAnsi="Verdana"/>
+        </w:rPr>
         <w:t>etc.</w:t>
       </w:r>
       <w:r>
+        <w:rPr>
+          <w:rFonts w:ascii="Verdana" w:hAnsi="Verdana"/>
+        </w:rPr>
         <w:t xml:space="preserve">, además </w:t>
       </w:r>
       <w:r>
+        <w:rPr>
+          <w:rFonts w:ascii="Verdana" w:hAnsi="Verdana"/>
+        </w:rPr>
         <w:t xml:space="preserve">de que, como fan de las figuras históricas, ver que éstas son uno de los ejes centrales de la historia hace que </w:t>
       </w:r>
       <w:r>
+        <w:rPr>
+          <w:rFonts w:ascii="Verdana" w:hAnsi="Verdana"/>
+        </w:rPr>
         <w:t>le tenga todavía más aprecio</w:t>
       </w:r>
       <w:r>
+        <w:rPr>
+          <w:rFonts w:ascii="Verdana" w:hAnsi="Verdana"/>
+        </w:rPr>
         <w:t>. Como se comentó previamente,</w:t>
       </w:r>
       <w:r>
+        <w:rPr>
+          <w:rFonts w:ascii="Verdana" w:hAnsi="Verdana"/>
+        </w:rPr>
         <w:t xml:space="preserve"> </w:t>
       </w:r>
       <w:r>
+        <w:rPr>
+          <w:rFonts w:ascii="Verdana" w:hAnsi="Verdana"/>
+        </w:rPr>
         <w:t xml:space="preserve">este manga, a pesar de que es bastante bueno, </w:t>
       </w:r>
       <w:r>
+        <w:rPr>
+          <w:rFonts w:ascii="Verdana" w:hAnsi="Verdana"/>
+        </w:rPr>
         <w:t>es poco conocido,</w:t>
       </w:r>
       <w:r>
+        <w:rPr>
+          <w:rFonts w:ascii="Verdana" w:hAnsi="Verdana"/>
+        </w:rPr>
         <w:t xml:space="preserve"> más allá de una Wikipedia y la página oficial, realmente no hay casi nada de contenido relacionado a éste en internet, por lo que decidí usar mi proyecto como una excusa para promocionarlo y a su vez hablar de </w:t>
       </w:r>
       <w:r>
+        <w:rPr>
+          <w:rFonts w:ascii="Verdana" w:hAnsi="Verdana"/>
+        </w:rPr>
         <w:t>algo que me gusta bastante.</w:t>
       </w:r>
     </w:p>
     <w:p>
       <w:pPr>
         <w:spacing w:after="0"/>
-      </w:pPr>
-    </w:p>
-    <w:p>
-      <w:pPr>
-        <w:spacing w:after="0"/>
-      </w:pPr>
-      <w:r>
+        <w:rPr>
+          <w:rFonts w:ascii="Verdana" w:hAnsi="Verdana"/>
+        </w:rPr>
+      </w:pPr>
+    </w:p>
+    <w:p>
+      <w:pPr>
+        <w:pStyle w:val="Ttulo2"/>
+        <w:rPr>
+          <w:rFonts w:ascii="Verdana" w:hAnsi="Verdana"/>
+        </w:rPr>
+      </w:pPr>
+      <w:r>
+        <w:rPr>
+          <w:rFonts w:ascii="Verdana" w:hAnsi="Verdana"/>
+        </w:rPr>
         <w:t>- Contexto del proyecto</w:t>
       </w:r>
     </w:p>
     <w:p>
       <w:pPr>
         <w:spacing w:after="0"/>
-      </w:pPr>
-      <w:r>
+        <w:rPr>
+          <w:rFonts w:ascii="Verdana" w:hAnsi="Verdana"/>
+        </w:rPr>
+      </w:pPr>
+      <w:r>
+        <w:rPr>
+          <w:rFonts w:ascii="Verdana" w:hAnsi="Verdana"/>
+        </w:rPr>
         <w:t>La página web pretende abordar</w:t>
       </w:r>
       <w:r>
+        <w:rPr>
+          <w:rFonts w:ascii="Verdana" w:hAnsi="Verdana"/>
+        </w:rPr>
         <w:t xml:space="preserve"> una sinopsis central de la historia y dedicarse a hablar de las distintas facciones, con un propósito </w:t>
       </w:r>
     </w:p>
     <w:p>
       <w:pPr>
         <w:spacing w:after="0"/>
-      </w:pPr>
-    </w:p>
-    <w:p>
-      <w:pPr>
-        <w:spacing w:after="0"/>
+        <w:rPr>
+          <w:rFonts w:ascii="Verdana" w:hAnsi="Verdana"/>
+        </w:rPr>
+      </w:pPr>
+    </w:p>
+    <w:p>
+      <w:pPr>
+        <w:pStyle w:val="Ttulo1"/>
       </w:pPr>
       <w:r>
         <w:t xml:space="preserve">2. FASE DE DEFINICIÓN DEL PROYECTO </w:t>
@@ -249,99 +557,249 @@
     <w:p>
       <w:pPr>
         <w:spacing w:after="0"/>
-      </w:pPr>
-      <w:r>
+        <w:rPr>
+          <w:rFonts w:ascii="Verdana" w:hAnsi="Verdana"/>
+        </w:rPr>
+      </w:pPr>
+      <w:r>
+        <w:rPr>
+          <w:rFonts w:ascii="Verdana" w:hAnsi="Verdana"/>
+        </w:rPr>
         <w:t xml:space="preserve">Según las indicaciones del documento "Pasos de Diseño" entregado: </w:t>
       </w:r>
     </w:p>
     <w:p>
       <w:pPr>
         <w:spacing w:after="0"/>
-      </w:pPr>
-      <w:r>
-        <w:t xml:space="preserve">- Análisis de información necesaria </w:t>
-      </w:r>
-    </w:p>
-    <w:p>
-      <w:pPr>
-        <w:spacing w:after="0"/>
-      </w:pPr>
-      <w:r>
+        <w:rPr>
+          <w:rFonts w:ascii="Verdana" w:hAnsi="Verdana"/>
+        </w:rPr>
+      </w:pPr>
+      <w:r>
+        <w:rPr>
+          <w:rFonts w:ascii="Verdana" w:hAnsi="Verdana"/>
+        </w:rPr>
+        <w:t>- Análisis de información necesaria</w:t>
+      </w:r>
+    </w:p>
+    <w:p>
+      <w:pPr>
+        <w:spacing w:after="0"/>
+        <w:rPr>
+          <w:rFonts w:ascii="Verdana" w:hAnsi="Verdana"/>
+        </w:rPr>
+      </w:pPr>
+    </w:p>
+    <w:p>
+      <w:pPr>
+        <w:spacing w:after="0"/>
+        <w:rPr>
+          <w:rFonts w:ascii="Verdana" w:hAnsi="Verdana"/>
+        </w:rPr>
+      </w:pPr>
+      <w:r>
+        <w:rPr>
+          <w:rFonts w:ascii="Verdana" w:hAnsi="Verdana"/>
+        </w:rPr>
         <w:t xml:space="preserve">- Objetivos del proyecto (generales y específicos) </w:t>
       </w:r>
     </w:p>
     <w:p>
       <w:pPr>
         <w:spacing w:after="0"/>
-      </w:pPr>
-      <w:r>
+        <w:rPr>
+          <w:rFonts w:ascii="Verdana" w:hAnsi="Verdana"/>
+        </w:rPr>
+      </w:pPr>
+    </w:p>
+    <w:p>
+      <w:pPr>
+        <w:spacing w:after="0"/>
+        <w:rPr>
+          <w:rFonts w:ascii="Verdana" w:hAnsi="Verdana"/>
+        </w:rPr>
+      </w:pPr>
+      <w:r>
+        <w:rPr>
+          <w:rFonts w:ascii="Verdana" w:hAnsi="Verdana"/>
+        </w:rPr>
         <w:t>- Identificación del contenido</w:t>
       </w:r>
     </w:p>
     <w:p>
       <w:pPr>
         <w:spacing w:after="0"/>
-      </w:pPr>
-      <w:r>
+        <w:rPr>
+          <w:rFonts w:ascii="Verdana" w:hAnsi="Verdana"/>
+        </w:rPr>
+      </w:pPr>
+    </w:p>
+    <w:p>
+      <w:pPr>
+        <w:spacing w:after="0"/>
+        <w:rPr>
+          <w:rFonts w:ascii="Verdana" w:hAnsi="Verdana"/>
+        </w:rPr>
+      </w:pPr>
+      <w:r>
+        <w:rPr>
+          <w:rFonts w:ascii="Verdana" w:hAnsi="Verdana"/>
+        </w:rPr>
         <w:t xml:space="preserve">- Análisis del entorno y competencia </w:t>
       </w:r>
     </w:p>
     <w:p>
       <w:pPr>
         <w:spacing w:after="0"/>
-      </w:pPr>
-      <w:r>
+        <w:rPr>
+          <w:rFonts w:ascii="Verdana" w:hAnsi="Verdana"/>
+        </w:rPr>
+      </w:pPr>
+    </w:p>
+    <w:p>
+      <w:pPr>
+        <w:spacing w:after="0"/>
+        <w:rPr>
+          <w:rFonts w:ascii="Verdana" w:hAnsi="Verdana"/>
+        </w:rPr>
+      </w:pPr>
+      <w:r>
+        <w:rPr>
+          <w:rFonts w:ascii="Verdana" w:hAnsi="Verdana"/>
+        </w:rPr>
+        <w:lastRenderedPageBreak/>
         <w:t xml:space="preserve">- Funcionalidades previstas </w:t>
       </w:r>
     </w:p>
     <w:p>
       <w:pPr>
         <w:spacing w:after="0"/>
-      </w:pPr>
-      <w:r>
+        <w:rPr>
+          <w:rFonts w:ascii="Verdana" w:hAnsi="Verdana"/>
+        </w:rPr>
+      </w:pPr>
+    </w:p>
+    <w:p>
+      <w:pPr>
+        <w:spacing w:after="0"/>
+        <w:rPr>
+          <w:rFonts w:ascii="Verdana" w:hAnsi="Verdana"/>
+        </w:rPr>
+      </w:pPr>
+      <w:r>
+        <w:rPr>
+          <w:rFonts w:ascii="Verdana" w:hAnsi="Verdana"/>
+        </w:rPr>
         <w:t xml:space="preserve">- Perfil de usuarios/clientes objetivo </w:t>
       </w:r>
     </w:p>
     <w:p>
       <w:pPr>
         <w:spacing w:after="0"/>
-      </w:pPr>
-      <w:r>
+        <w:rPr>
+          <w:rFonts w:ascii="Verdana" w:hAnsi="Verdana"/>
+        </w:rPr>
+      </w:pPr>
+    </w:p>
+    <w:p>
+      <w:pPr>
+        <w:spacing w:after="0"/>
+        <w:rPr>
+          <w:rFonts w:ascii="Verdana" w:hAnsi="Verdana"/>
+        </w:rPr>
+      </w:pPr>
+      <w:r>
+        <w:rPr>
+          <w:rFonts w:ascii="Verdana" w:hAnsi="Verdana"/>
+        </w:rPr>
         <w:t xml:space="preserve">- Medios de ejecución </w:t>
       </w:r>
     </w:p>
     <w:p>
       <w:pPr>
         <w:spacing w:after="0"/>
-      </w:pPr>
-      <w:r>
+        <w:rPr>
+          <w:rFonts w:ascii="Verdana" w:hAnsi="Verdana"/>
+        </w:rPr>
+      </w:pPr>
+    </w:p>
+    <w:p>
+      <w:pPr>
+        <w:spacing w:after="0"/>
+        <w:rPr>
+          <w:rFonts w:ascii="Verdana" w:hAnsi="Verdana"/>
+        </w:rPr>
+      </w:pPr>
+      <w:r>
+        <w:rPr>
+          <w:rFonts w:ascii="Verdana" w:hAnsi="Verdana"/>
+        </w:rPr>
         <w:t xml:space="preserve">- Requisitos tecnológicos </w:t>
       </w:r>
     </w:p>
     <w:p>
       <w:pPr>
         <w:spacing w:after="0"/>
-      </w:pPr>
-      <w:r>
+        <w:rPr>
+          <w:rFonts w:ascii="Verdana" w:hAnsi="Verdana"/>
+        </w:rPr>
+      </w:pPr>
+    </w:p>
+    <w:p>
+      <w:pPr>
+        <w:spacing w:after="0"/>
+        <w:rPr>
+          <w:rFonts w:ascii="Verdana" w:hAnsi="Verdana"/>
+        </w:rPr>
+      </w:pPr>
+      <w:r>
+        <w:rPr>
+          <w:rFonts w:ascii="Verdana" w:hAnsi="Verdana"/>
+        </w:rPr>
         <w:t xml:space="preserve">- Presupuesto estimado </w:t>
       </w:r>
     </w:p>
     <w:p>
       <w:pPr>
         <w:spacing w:after="0"/>
-      </w:pPr>
-      <w:r>
+        <w:rPr>
+          <w:rFonts w:ascii="Verdana" w:hAnsi="Verdana"/>
+        </w:rPr>
+      </w:pPr>
+    </w:p>
+    <w:p>
+      <w:pPr>
+        <w:spacing w:after="0"/>
+        <w:rPr>
+          <w:rFonts w:ascii="Verdana" w:hAnsi="Verdana"/>
+        </w:rPr>
+      </w:pPr>
+      <w:r>
+        <w:rPr>
+          <w:rFonts w:ascii="Verdana" w:hAnsi="Verdana"/>
+        </w:rPr>
         <w:t xml:space="preserve">- Cronograma de la fase de definición </w:t>
       </w:r>
     </w:p>
     <w:p>
       <w:pPr>
         <w:spacing w:after="0"/>
-      </w:pPr>
-    </w:p>
-    <w:p>
-      <w:pPr>
-        <w:spacing w:after="0"/>
+        <w:rPr>
+          <w:rFonts w:ascii="Verdana" w:hAnsi="Verdana"/>
+        </w:rPr>
+      </w:pPr>
+    </w:p>
+    <w:p>
+      <w:pPr>
+        <w:spacing w:after="0"/>
+        <w:rPr>
+          <w:rFonts w:ascii="Verdana" w:hAnsi="Verdana"/>
+        </w:rPr>
+      </w:pPr>
+    </w:p>
+    <w:p>
+      <w:pPr>
+        <w:pStyle w:val="Ttulo1"/>
       </w:pPr>
       <w:r>
         <w:t xml:space="preserve">3. FASE DE ARQUITECTURA </w:t>
@@ -350,179 +808,434 @@
     <w:p>
       <w:pPr>
         <w:spacing w:after="0"/>
+        <w:rPr>
+          <w:rFonts w:ascii="Verdana" w:hAnsi="Verdana"/>
+        </w:rPr>
+      </w:pPr>
+      <w:r>
+        <w:rPr>
+          <w:rFonts w:ascii="Verdana" w:hAnsi="Verdana"/>
+        </w:rPr>
+        <w:t xml:space="preserve">Según las indicaciones del documento "Pasos de Diseño" entregado: </w:t>
+      </w:r>
+    </w:p>
+    <w:p>
+      <w:pPr>
+        <w:spacing w:after="0"/>
+        <w:rPr>
+          <w:rFonts w:ascii="Verdana" w:hAnsi="Verdana"/>
+        </w:rPr>
+      </w:pPr>
+    </w:p>
+    <w:p>
+      <w:pPr>
+        <w:spacing w:after="0"/>
+        <w:rPr>
+          <w:rFonts w:ascii="Verdana" w:hAnsi="Verdana"/>
+        </w:rPr>
+      </w:pPr>
+      <w:r>
+        <w:rPr>
+          <w:rFonts w:ascii="Verdana" w:hAnsi="Verdana"/>
+        </w:rPr>
+        <w:t xml:space="preserve">- Arquitectura de la información </w:t>
+      </w:r>
+    </w:p>
+    <w:p>
+      <w:pPr>
+        <w:spacing w:after="0"/>
+        <w:rPr>
+          <w:rFonts w:ascii="Verdana" w:hAnsi="Verdana"/>
+        </w:rPr>
+      </w:pPr>
+    </w:p>
+    <w:p>
+      <w:pPr>
+        <w:spacing w:after="0"/>
+        <w:rPr>
+          <w:rFonts w:ascii="Verdana" w:hAnsi="Verdana"/>
+        </w:rPr>
+      </w:pPr>
+      <w:r>
+        <w:rPr>
+          <w:rFonts w:ascii="Verdana" w:hAnsi="Verdana"/>
+        </w:rPr>
+        <w:t xml:space="preserve">- Estructura del proyecto </w:t>
+      </w:r>
+    </w:p>
+    <w:p>
+      <w:pPr>
+        <w:spacing w:after="0"/>
+        <w:rPr>
+          <w:rFonts w:ascii="Verdana" w:hAnsi="Verdana"/>
+        </w:rPr>
+      </w:pPr>
+    </w:p>
+    <w:p>
+      <w:pPr>
+        <w:spacing w:after="0"/>
+        <w:rPr>
+          <w:rFonts w:ascii="Verdana" w:hAnsi="Verdana"/>
+        </w:rPr>
+      </w:pPr>
+      <w:r>
+        <w:rPr>
+          <w:rFonts w:ascii="Verdana" w:hAnsi="Verdana"/>
+        </w:rPr>
+        <w:t xml:space="preserve">- Roles y responsabilidades (si es necesario) </w:t>
+      </w:r>
+    </w:p>
+    <w:p>
+      <w:pPr>
+        <w:spacing w:after="0"/>
+        <w:rPr>
+          <w:rFonts w:ascii="Verdana" w:hAnsi="Verdana"/>
+        </w:rPr>
+      </w:pPr>
+    </w:p>
+    <w:p>
+      <w:pPr>
+        <w:spacing w:after="0"/>
+        <w:rPr>
+          <w:rFonts w:ascii="Verdana" w:hAnsi="Verdana"/>
+        </w:rPr>
+      </w:pPr>
+      <w:r>
+        <w:rPr>
+          <w:rFonts w:ascii="Verdana" w:hAnsi="Verdana"/>
+        </w:rPr>
+        <w:t xml:space="preserve">- Mecanismos de recogida de información </w:t>
+      </w:r>
+    </w:p>
+    <w:p>
+      <w:pPr>
+        <w:spacing w:after="0"/>
+        <w:rPr>
+          <w:rFonts w:ascii="Verdana" w:hAnsi="Verdana"/>
+        </w:rPr>
+      </w:pPr>
+    </w:p>
+    <w:p>
+      <w:pPr>
+        <w:spacing w:after="0"/>
+        <w:rPr>
+          <w:rFonts w:ascii="Verdana" w:hAnsi="Verdana"/>
+        </w:rPr>
+      </w:pPr>
+      <w:r>
+        <w:rPr>
+          <w:rFonts w:ascii="Verdana" w:hAnsi="Verdana"/>
+        </w:rPr>
+        <w:t xml:space="preserve">- Definición de vínculos entre datos </w:t>
+      </w:r>
+    </w:p>
+    <w:p>
+      <w:pPr>
+        <w:spacing w:after="0"/>
+        <w:rPr>
+          <w:rFonts w:ascii="Verdana" w:hAnsi="Verdana"/>
+        </w:rPr>
+      </w:pPr>
+    </w:p>
+    <w:p>
+      <w:pPr>
+        <w:spacing w:after="0"/>
+        <w:rPr>
+          <w:rFonts w:ascii="Verdana" w:hAnsi="Verdana"/>
+        </w:rPr>
+      </w:pPr>
+      <w:r>
+        <w:rPr>
+          <w:rFonts w:ascii="Verdana" w:hAnsi="Verdana"/>
+        </w:rPr>
+        <w:t xml:space="preserve">- Recursos necesarios </w:t>
+      </w:r>
+    </w:p>
+    <w:p>
+      <w:pPr>
+        <w:spacing w:after="0"/>
+        <w:rPr>
+          <w:rFonts w:ascii="Verdana" w:hAnsi="Verdana"/>
+        </w:rPr>
+      </w:pPr>
+    </w:p>
+    <w:p>
+      <w:pPr>
+        <w:spacing w:after="0"/>
+        <w:rPr>
+          <w:rFonts w:ascii="Verdana" w:hAnsi="Verdana"/>
+        </w:rPr>
+      </w:pPr>
+      <w:r>
+        <w:rPr>
+          <w:rFonts w:ascii="Verdana" w:hAnsi="Verdana"/>
+        </w:rPr>
+        <w:t xml:space="preserve">- Propuesta de diseño/implantación </w:t>
+      </w:r>
+    </w:p>
+    <w:p>
+      <w:pPr>
+        <w:spacing w:after="0"/>
+        <w:rPr>
+          <w:rFonts w:ascii="Verdana" w:hAnsi="Verdana"/>
+        </w:rPr>
+      </w:pPr>
+    </w:p>
+    <w:p>
+      <w:pPr>
+        <w:spacing w:after="0"/>
+        <w:rPr>
+          <w:rFonts w:ascii="Verdana" w:hAnsi="Verdana"/>
+        </w:rPr>
+      </w:pPr>
+      <w:r>
+        <w:rPr>
+          <w:rFonts w:ascii="Verdana" w:hAnsi="Verdana"/>
+        </w:rPr>
+        <w:t xml:space="preserve">- Prototipos y modelos de organización </w:t>
+      </w:r>
+    </w:p>
+    <w:p>
+      <w:pPr>
+        <w:spacing w:after="0"/>
+        <w:rPr>
+          <w:rFonts w:ascii="Verdana" w:hAnsi="Verdana"/>
+        </w:rPr>
+      </w:pPr>
+    </w:p>
+    <w:p>
+      <w:pPr>
+        <w:spacing w:after="0"/>
+        <w:rPr>
+          <w:rFonts w:ascii="Verdana" w:hAnsi="Verdana"/>
+        </w:rPr>
+      </w:pPr>
+      <w:r>
+        <w:rPr>
+          <w:rFonts w:ascii="Verdana" w:hAnsi="Verdana"/>
+        </w:rPr>
+        <w:t xml:space="preserve">- Mapa de navegación del sitio web </w:t>
+      </w:r>
+    </w:p>
+    <w:p>
+      <w:pPr>
+        <w:spacing w:after="0"/>
+        <w:rPr>
+          <w:rFonts w:ascii="Verdana" w:hAnsi="Verdana"/>
+        </w:rPr>
+      </w:pPr>
+    </w:p>
+    <w:p>
+      <w:pPr>
+        <w:spacing w:after="0"/>
+        <w:rPr>
+          <w:rFonts w:ascii="Verdana" w:hAnsi="Verdana"/>
+        </w:rPr>
+      </w:pPr>
+      <w:r>
+        <w:rPr>
+          <w:rFonts w:ascii="Verdana" w:hAnsi="Verdana"/>
+        </w:rPr>
+        <w:t xml:space="preserve">- Plataforma tecnológica adoptada (HTML, CSS, JavaScript, PHP, MySQL, etc.) </w:t>
+      </w:r>
+    </w:p>
+    <w:p>
+      <w:pPr>
+        <w:spacing w:after="0"/>
+        <w:rPr>
+          <w:rFonts w:ascii="Verdana" w:hAnsi="Verdana"/>
+        </w:rPr>
+      </w:pPr>
+    </w:p>
+    <w:p>
+      <w:pPr>
+        <w:spacing w:after="0"/>
+        <w:rPr>
+          <w:rFonts w:ascii="Verdana" w:hAnsi="Verdana"/>
+        </w:rPr>
+      </w:pPr>
+      <w:r>
+        <w:rPr>
+          <w:rFonts w:ascii="Verdana" w:hAnsi="Verdana"/>
+        </w:rPr>
+        <w:t xml:space="preserve">- Plan de marketing y comunicación (opcional) </w:t>
+      </w:r>
+    </w:p>
+    <w:p>
+      <w:pPr>
+        <w:spacing w:after="0"/>
+        <w:rPr>
+          <w:rFonts w:ascii="Verdana" w:hAnsi="Verdana"/>
+        </w:rPr>
+      </w:pPr>
+    </w:p>
+    <w:p>
+      <w:pPr>
+        <w:spacing w:after="0"/>
+        <w:rPr>
+          <w:rFonts w:ascii="Verdana" w:hAnsi="Verdana"/>
+        </w:rPr>
+      </w:pPr>
+      <w:r>
+        <w:rPr>
+          <w:rFonts w:ascii="Verdana" w:hAnsi="Verdana"/>
+        </w:rPr>
+        <w:t xml:space="preserve">- Análisis de riesgos </w:t>
+      </w:r>
+    </w:p>
+    <w:p>
+      <w:pPr>
+        <w:spacing w:after="0"/>
+        <w:rPr>
+          <w:rFonts w:ascii="Verdana" w:hAnsi="Verdana"/>
+        </w:rPr>
+      </w:pPr>
+    </w:p>
+    <w:p>
+      <w:pPr>
+        <w:spacing w:after="0"/>
+        <w:rPr>
+          <w:rFonts w:ascii="Verdana" w:hAnsi="Verdana"/>
+        </w:rPr>
+      </w:pPr>
+      <w:r>
+        <w:rPr>
+          <w:rFonts w:ascii="Verdana" w:hAnsi="Verdana"/>
+        </w:rPr>
+        <w:t>- Normativas y políticas aplicables</w:t>
+      </w:r>
+    </w:p>
+    <w:p>
+      <w:pPr>
+        <w:spacing w:after="0"/>
+        <w:rPr>
+          <w:rFonts w:ascii="Verdana" w:hAnsi="Verdana"/>
+        </w:rPr>
+      </w:pPr>
+    </w:p>
+    <w:p>
+      <w:pPr>
+        <w:spacing w:after="0"/>
+        <w:rPr>
+          <w:rFonts w:ascii="Verdana" w:hAnsi="Verdana"/>
+        </w:rPr>
+      </w:pPr>
+      <w:r>
+        <w:rPr>
+          <w:rFonts w:ascii="Verdana" w:hAnsi="Verdana"/>
+        </w:rPr>
+        <w:t xml:space="preserve">- Cronograma de la fase de arquitectura </w:t>
+      </w:r>
+    </w:p>
+    <w:p>
+      <w:pPr>
+        <w:spacing w:after="0"/>
+        <w:rPr>
+          <w:rFonts w:ascii="Verdana" w:hAnsi="Verdana"/>
+        </w:rPr>
+      </w:pPr>
+    </w:p>
+    <w:p>
+      <w:pPr>
+        <w:spacing w:after="0"/>
+        <w:rPr>
+          <w:rFonts w:ascii="Verdana" w:hAnsi="Verdana"/>
+        </w:rPr>
+      </w:pPr>
+    </w:p>
+    <w:p>
+      <w:pPr>
+        <w:pStyle w:val="Ttulo1"/>
       </w:pPr>
       <w:r>
         <w:lastRenderedPageBreak/>
+        <w:t xml:space="preserve">4. FASE DE DISEÑO </w:t>
+      </w:r>
+    </w:p>
+    <w:p>
+      <w:pPr>
+        <w:spacing w:after="0"/>
+        <w:rPr>
+          <w:rFonts w:ascii="Verdana" w:hAnsi="Verdana"/>
+        </w:rPr>
+      </w:pPr>
+      <w:r>
+        <w:rPr>
+          <w:rFonts w:ascii="Verdana" w:hAnsi="Verdana"/>
+        </w:rPr>
         <w:t xml:space="preserve">Según las indicaciones del documento "Pasos de Diseño" entregado: </w:t>
       </w:r>
     </w:p>
     <w:p>
       <w:pPr>
         <w:spacing w:after="0"/>
-      </w:pPr>
-      <w:r>
-        <w:t xml:space="preserve">- Arquitectura de la información </w:t>
-      </w:r>
-    </w:p>
-    <w:p>
-      <w:pPr>
-        <w:spacing w:after="0"/>
-      </w:pPr>
-      <w:r>
-        <w:t xml:space="preserve">- Estructura del proyecto </w:t>
-      </w:r>
-    </w:p>
-    <w:p>
-      <w:pPr>
-        <w:spacing w:after="0"/>
-      </w:pPr>
-      <w:r>
-        <w:t xml:space="preserve">- Roles y responsabilidades (si es necesario) </w:t>
-      </w:r>
-    </w:p>
-    <w:p>
-      <w:pPr>
-        <w:spacing w:after="0"/>
-      </w:pPr>
-      <w:r>
-        <w:t xml:space="preserve">- Mecanismos de recogida de información </w:t>
-      </w:r>
-    </w:p>
-    <w:p>
-      <w:pPr>
-        <w:spacing w:after="0"/>
-      </w:pPr>
-      <w:r>
-        <w:t xml:space="preserve">- Definición de vínculos entre datos </w:t>
-      </w:r>
-    </w:p>
-    <w:p>
-      <w:pPr>
-        <w:spacing w:after="0"/>
-      </w:pPr>
-      <w:r>
-        <w:t xml:space="preserve">- Recursos necesarios </w:t>
-      </w:r>
-    </w:p>
-    <w:p>
-      <w:pPr>
-        <w:spacing w:after="0"/>
-      </w:pPr>
-      <w:r>
-        <w:t xml:space="preserve">- Propuesta de diseño/implantación </w:t>
-      </w:r>
-    </w:p>
-    <w:p>
-      <w:pPr>
-        <w:spacing w:after="0"/>
-      </w:pPr>
-      <w:r>
-        <w:t xml:space="preserve">- Prototipos y modelos de organización </w:t>
-      </w:r>
-    </w:p>
-    <w:p>
-      <w:pPr>
-        <w:spacing w:after="0"/>
-      </w:pPr>
-      <w:r>
-        <w:t xml:space="preserve">- Mapa de navegación del sitio web </w:t>
-      </w:r>
-    </w:p>
-    <w:p>
-      <w:pPr>
-        <w:spacing w:after="0"/>
-      </w:pPr>
-      <w:r>
-        <w:t xml:space="preserve">- Plataforma tecnológica adoptada (HTML, CSS, JavaScript, PHP, MySQL, etc.) </w:t>
-      </w:r>
-    </w:p>
-    <w:p>
-      <w:pPr>
-        <w:spacing w:after="0"/>
-      </w:pPr>
-      <w:r>
-        <w:t xml:space="preserve">- Plan de marketing y comunicación (opcional) </w:t>
-      </w:r>
-    </w:p>
-    <w:p>
-      <w:pPr>
-        <w:spacing w:after="0"/>
-      </w:pPr>
-      <w:r>
-        <w:t xml:space="preserve">- Análisis de riesgos </w:t>
-      </w:r>
-    </w:p>
-    <w:p>
-      <w:pPr>
-        <w:spacing w:after="0"/>
-      </w:pPr>
-      <w:r>
-        <w:t>- Normativas y políticas aplicables</w:t>
-      </w:r>
-    </w:p>
-    <w:p>
-      <w:pPr>
-        <w:spacing w:after="0"/>
-      </w:pPr>
-      <w:r>
-        <w:t xml:space="preserve">- Cronograma de la fase de arquitectura </w:t>
-      </w:r>
-    </w:p>
-    <w:p>
-      <w:pPr>
-        <w:spacing w:after="0"/>
-      </w:pPr>
-    </w:p>
-    <w:p>
-      <w:pPr>
-        <w:spacing w:after="0"/>
-      </w:pPr>
-      <w:r>
-        <w:t xml:space="preserve">4. FASE DE DISEÑO </w:t>
-      </w:r>
-    </w:p>
-    <w:p>
-      <w:pPr>
-        <w:spacing w:after="0"/>
-      </w:pPr>
-      <w:r>
-        <w:t xml:space="preserve">Según las indicaciones del documento "Pasos de Diseño" entregado: </w:t>
-      </w:r>
-    </w:p>
-    <w:p>
-      <w:pPr>
-        <w:spacing w:after="0"/>
-      </w:pPr>
-      <w:r>
+        <w:rPr>
+          <w:rFonts w:ascii="Verdana" w:hAnsi="Verdana"/>
+        </w:rPr>
+      </w:pPr>
+    </w:p>
+    <w:p>
+      <w:pPr>
+        <w:pStyle w:val="Ttulo2"/>
+        <w:rPr>
+          <w:rFonts w:ascii="Verdana" w:hAnsi="Verdana"/>
+        </w:rPr>
+      </w:pPr>
+      <w:r>
+        <w:rPr>
+          <w:rFonts w:ascii="Verdana" w:hAnsi="Verdana"/>
+        </w:rPr>
         <w:t xml:space="preserve">- Paleta de colores (justificada) </w:t>
       </w:r>
     </w:p>
     <w:p>
       <w:pPr>
         <w:spacing w:after="0"/>
-      </w:pPr>
-      <w:r>
+        <w:rPr>
+          <w:rFonts w:ascii="Verdana" w:hAnsi="Verdana"/>
+        </w:rPr>
+      </w:pPr>
+      <w:r>
+        <w:rPr>
+          <w:rFonts w:ascii="Verdana" w:hAnsi="Verdana"/>
+        </w:rPr>
         <w:t>La paleta de colores sele</w:t>
       </w:r>
       <w:r>
+        <w:rPr>
+          <w:rFonts w:ascii="Verdana" w:hAnsi="Verdana"/>
+        </w:rPr>
         <w:t>ccionada para este proyecto es la que se puede apreciar más abajo, la razón de escogerla es porque estos son los colores que predominan en arte promocional y en las portadas del manga</w:t>
       </w:r>
       <w:r>
+        <w:rPr>
+          <w:rFonts w:ascii="Verdana" w:hAnsi="Verdana"/>
+        </w:rPr>
         <w:t>, habiendo leves variaciones sobre los mismo</w:t>
       </w:r>
       <w:r>
+        <w:rPr>
+          <w:rFonts w:ascii="Verdana" w:hAnsi="Verdana"/>
+        </w:rPr>
         <w:t>s.</w:t>
       </w:r>
       <w:r>
+        <w:rPr>
+          <w:rFonts w:ascii="Verdana" w:hAnsi="Verdana"/>
+        </w:rPr>
         <w:t xml:space="preserve"> </w:t>
       </w:r>
     </w:p>
     <w:p>
       <w:pPr>
         <w:spacing w:after="0"/>
-      </w:pPr>
-      <w:r>
-        <w:rPr>
+        <w:rPr>
+          <w:rFonts w:ascii="Verdana" w:hAnsi="Verdana"/>
+        </w:rPr>
+      </w:pPr>
+      <w:r>
+        <w:rPr>
+          <w:rFonts w:ascii="Verdana" w:hAnsi="Verdana"/>
           <w:noProof/>
         </w:rPr>
         <w:drawing>
@@ -564,182 +1277,492 @@
     </w:p>
     <w:p>
       <w:pPr>
-        <w:spacing w:after="0"/>
-      </w:pPr>
-      <w:r>
+        <w:pStyle w:val="Ttulo2"/>
+        <w:rPr>
+          <w:rFonts w:ascii="Verdana" w:hAnsi="Verdana"/>
+        </w:rPr>
+      </w:pPr>
+      <w:r>
+        <w:rPr>
+          <w:rFonts w:ascii="Verdana" w:hAnsi="Verdana"/>
+        </w:rPr>
         <w:t xml:space="preserve">- Tipografías seleccionadas </w:t>
       </w:r>
     </w:p>
     <w:p>
       <w:pPr>
         <w:spacing w:after="0"/>
-      </w:pPr>
-      <w:r>
-        <w:t xml:space="preserve"> &gt; </w:t>
-      </w:r>
-      <w:r>
-        <w:t>Agency FB</w:t>
-      </w:r>
-      <w:r>
+        <w:rPr>
+          <w:rFonts w:ascii="Verdana" w:hAnsi="Verdana"/>
+        </w:rPr>
+      </w:pPr>
+      <w:r>
+        <w:rPr>
+          <w:rFonts w:ascii="Verdana" w:hAnsi="Verdana"/>
+        </w:rPr>
+        <w:t xml:space="preserve"> &gt; Agency FB</w:t>
+      </w:r>
+      <w:r>
+        <w:rPr>
+          <w:rFonts w:ascii="Verdana" w:hAnsi="Verdana"/>
+        </w:rPr>
         <w:t>.</w:t>
       </w:r>
     </w:p>
     <w:p>
       <w:pPr>
         <w:spacing w:after="0"/>
-      </w:pPr>
-      <w:r>
-        <w:t>&gt; Times New Roman</w:t>
-      </w:r>
-      <w:r>
+        <w:rPr>
+          <w:rFonts w:ascii="Verdana" w:hAnsi="Verdana"/>
+        </w:rPr>
+      </w:pPr>
+      <w:r>
+        <w:rPr>
+          <w:rFonts w:ascii="Verdana" w:hAnsi="Verdana"/>
+        </w:rPr>
+        <w:t xml:space="preserve">&gt; Times New </w:t>
+      </w:r>
+      <w:proofErr w:type="spellStart"/>
+      <w:r>
+        <w:rPr>
+          <w:rFonts w:ascii="Verdana" w:hAnsi="Verdana"/>
+        </w:rPr>
+        <w:t>Roman</w:t>
+      </w:r>
+      <w:proofErr w:type="spellEnd"/>
+      <w:r>
+        <w:rPr>
+          <w:rFonts w:ascii="Verdana" w:hAnsi="Verdana"/>
+        </w:rPr>
         <w:t>.</w:t>
       </w:r>
     </w:p>
     <w:p>
       <w:pPr>
         <w:spacing w:after="0"/>
-      </w:pPr>
-      <w:r>
+        <w:rPr>
+          <w:rFonts w:ascii="Verdana" w:hAnsi="Verdana"/>
+        </w:rPr>
+      </w:pPr>
+      <w:r>
+        <w:rPr>
+          <w:rFonts w:ascii="Verdana" w:hAnsi="Verdana"/>
+        </w:rPr>
         <w:t xml:space="preserve"> </w:t>
       </w:r>
     </w:p>
     <w:p>
       <w:pPr>
         <w:spacing w:after="0"/>
-      </w:pPr>
-      <w:r>
+        <w:rPr>
+          <w:rFonts w:ascii="Verdana" w:hAnsi="Verdana"/>
+        </w:rPr>
+      </w:pPr>
+      <w:r>
+        <w:rPr>
+          <w:rFonts w:ascii="Verdana" w:hAnsi="Verdana"/>
+        </w:rPr>
         <w:t xml:space="preserve">- Elementos visuales (imágenes, vídeos, iconos) </w:t>
       </w:r>
     </w:p>
     <w:p>
       <w:pPr>
         <w:spacing w:after="0"/>
-      </w:pPr>
-      <w:r>
-        <w:t xml:space="preserve">- Wireframes o bocetos </w:t>
-      </w:r>
-    </w:p>
-    <w:p>
-      <w:pPr>
-        <w:spacing w:after="0"/>
-      </w:pPr>
-      <w:r>
+        <w:rPr>
+          <w:rFonts w:ascii="Verdana" w:hAnsi="Verdana"/>
+        </w:rPr>
+      </w:pPr>
+    </w:p>
+    <w:p>
+      <w:pPr>
+        <w:spacing w:after="0"/>
+        <w:rPr>
+          <w:rFonts w:ascii="Verdana" w:hAnsi="Verdana"/>
+        </w:rPr>
+      </w:pPr>
+      <w:r>
+        <w:rPr>
+          <w:rFonts w:ascii="Verdana" w:hAnsi="Verdana"/>
+        </w:rPr>
+        <w:t xml:space="preserve">- </w:t>
+      </w:r>
+      <w:proofErr w:type="spellStart"/>
+      <w:r>
+        <w:rPr>
+          <w:rFonts w:ascii="Verdana" w:hAnsi="Verdana"/>
+        </w:rPr>
+        <w:t>Wireframes</w:t>
+      </w:r>
+      <w:proofErr w:type="spellEnd"/>
+      <w:r>
+        <w:rPr>
+          <w:rFonts w:ascii="Verdana" w:hAnsi="Verdana"/>
+        </w:rPr>
+        <w:t xml:space="preserve"> o bocetos </w:t>
+      </w:r>
+    </w:p>
+    <w:p>
+      <w:pPr>
+        <w:spacing w:after="0"/>
+        <w:rPr>
+          <w:rFonts w:ascii="Verdana" w:hAnsi="Verdana"/>
+        </w:rPr>
+      </w:pPr>
+    </w:p>
+    <w:p>
+      <w:pPr>
+        <w:spacing w:after="0"/>
+        <w:rPr>
+          <w:rFonts w:ascii="Verdana" w:hAnsi="Verdana"/>
+        </w:rPr>
+      </w:pPr>
+      <w:r>
+        <w:rPr>
+          <w:rFonts w:ascii="Verdana" w:hAnsi="Verdana"/>
+        </w:rPr>
         <w:t xml:space="preserve">- Mockups o prototipado del diseño final </w:t>
       </w:r>
     </w:p>
     <w:p>
       <w:pPr>
         <w:spacing w:after="0"/>
-      </w:pPr>
-      <w:r>
+        <w:rPr>
+          <w:rFonts w:ascii="Verdana" w:hAnsi="Verdana"/>
+        </w:rPr>
+      </w:pPr>
+    </w:p>
+    <w:p>
+      <w:pPr>
+        <w:spacing w:after="0"/>
+        <w:rPr>
+          <w:rFonts w:ascii="Verdana" w:hAnsi="Verdana"/>
+        </w:rPr>
+      </w:pPr>
+      <w:r>
+        <w:rPr>
+          <w:rFonts w:ascii="Verdana" w:hAnsi="Verdana"/>
+        </w:rPr>
         <w:t xml:space="preserve">- Guía de estilo </w:t>
       </w:r>
     </w:p>
     <w:p>
       <w:pPr>
         <w:spacing w:after="0"/>
-      </w:pPr>
-      <w:r>
+        <w:rPr>
+          <w:rFonts w:ascii="Verdana" w:hAnsi="Verdana"/>
+        </w:rPr>
+      </w:pPr>
+    </w:p>
+    <w:p>
+      <w:pPr>
+        <w:spacing w:after="0"/>
+        <w:rPr>
+          <w:rFonts w:ascii="Verdana" w:hAnsi="Verdana"/>
+        </w:rPr>
+      </w:pPr>
+      <w:r>
+        <w:rPr>
+          <w:rFonts w:ascii="Verdana" w:hAnsi="Verdana"/>
+        </w:rPr>
         <w:t>- Análisis de usabilidad</w:t>
       </w:r>
     </w:p>
     <w:p>
       <w:pPr>
         <w:spacing w:after="0"/>
-      </w:pPr>
-      <w:r>
+        <w:rPr>
+          <w:rFonts w:ascii="Verdana" w:hAnsi="Verdana"/>
+        </w:rPr>
+      </w:pPr>
+    </w:p>
+    <w:p>
+      <w:pPr>
+        <w:spacing w:after="0"/>
+        <w:rPr>
+          <w:rFonts w:ascii="Verdana" w:hAnsi="Verdana"/>
+        </w:rPr>
+      </w:pPr>
+      <w:r>
+        <w:rPr>
+          <w:rFonts w:ascii="Verdana" w:hAnsi="Verdana"/>
+        </w:rPr>
         <w:t xml:space="preserve">- Política de privacidad (si es necesario) </w:t>
       </w:r>
     </w:p>
     <w:p>
       <w:pPr>
         <w:spacing w:after="0"/>
-      </w:pPr>
-      <w:r>
+        <w:rPr>
+          <w:rFonts w:ascii="Verdana" w:hAnsi="Verdana"/>
+        </w:rPr>
+      </w:pPr>
+    </w:p>
+    <w:p>
+      <w:pPr>
+        <w:spacing w:after="0"/>
+        <w:rPr>
+          <w:rFonts w:ascii="Verdana" w:hAnsi="Verdana"/>
+        </w:rPr>
+      </w:pPr>
+      <w:r>
+        <w:rPr>
+          <w:rFonts w:ascii="Verdana" w:hAnsi="Verdana"/>
+        </w:rPr>
         <w:t>- Roles de diseño (si es necesario)</w:t>
       </w:r>
     </w:p>
     <w:p>
       <w:pPr>
         <w:spacing w:after="0"/>
-      </w:pPr>
-      <w:r>
+        <w:rPr>
+          <w:rFonts w:ascii="Verdana" w:hAnsi="Verdana"/>
+        </w:rPr>
+      </w:pPr>
+    </w:p>
+    <w:p>
+      <w:pPr>
+        <w:spacing w:after="0"/>
+        <w:rPr>
+          <w:rFonts w:ascii="Verdana" w:hAnsi="Verdana"/>
+        </w:rPr>
+      </w:pPr>
+      <w:r>
+        <w:rPr>
+          <w:rFonts w:ascii="Verdana" w:hAnsi="Verdana"/>
+        </w:rPr>
         <w:t xml:space="preserve"> </w:t>
       </w:r>
     </w:p>
     <w:p>
       <w:pPr>
-        <w:spacing w:after="0"/>
-      </w:pPr>
-      <w:r>
+        <w:pStyle w:val="Ttulo1"/>
+      </w:pPr>
+      <w:r>
+        <w:t xml:space="preserve">5. MANUAL TÉCNICO </w:t>
+      </w:r>
+    </w:p>
+    <w:p>
+      <w:pPr>
+        <w:spacing w:after="0"/>
+        <w:rPr>
+          <w:rFonts w:ascii="Verdana" w:hAnsi="Verdana"/>
+        </w:rPr>
+      </w:pPr>
+      <w:r>
+        <w:rPr>
+          <w:rFonts w:ascii="Verdana" w:hAnsi="Verdana"/>
+        </w:rPr>
+        <w:t xml:space="preserve">- Tecnologías utilizadas (versiones específicas) </w:t>
+      </w:r>
+    </w:p>
+    <w:p>
+      <w:pPr>
+        <w:spacing w:after="0"/>
+        <w:rPr>
+          <w:rFonts w:ascii="Verdana" w:hAnsi="Verdana"/>
+        </w:rPr>
+      </w:pPr>
+    </w:p>
+    <w:p>
+      <w:pPr>
+        <w:spacing w:after="0"/>
+        <w:rPr>
+          <w:rFonts w:ascii="Verdana" w:hAnsi="Verdana"/>
+        </w:rPr>
+      </w:pPr>
+      <w:r>
+        <w:rPr>
+          <w:rFonts w:ascii="Verdana" w:hAnsi="Verdana"/>
+        </w:rPr>
+        <w:t xml:space="preserve">- Estructura de archivos y directorios del proyecto </w:t>
+      </w:r>
+    </w:p>
+    <w:p>
+      <w:pPr>
+        <w:spacing w:after="0"/>
+        <w:rPr>
+          <w:rFonts w:ascii="Verdana" w:hAnsi="Verdana"/>
+        </w:rPr>
+      </w:pPr>
+    </w:p>
+    <w:p>
+      <w:pPr>
+        <w:spacing w:after="0"/>
+        <w:rPr>
+          <w:rFonts w:ascii="Verdana" w:hAnsi="Verdana"/>
+        </w:rPr>
+      </w:pPr>
+      <w:r>
+        <w:rPr>
+          <w:rFonts w:ascii="Verdana" w:hAnsi="Verdana"/>
+        </w:rPr>
         <w:lastRenderedPageBreak/>
-        <w:t xml:space="preserve">5. MANUAL TÉCNICO </w:t>
-      </w:r>
-    </w:p>
-    <w:p>
-      <w:pPr>
-        <w:spacing w:after="0"/>
-      </w:pPr>
-      <w:r>
-        <w:t xml:space="preserve">- Tecnologías utilizadas (versiones específicas) </w:t>
-      </w:r>
-    </w:p>
-    <w:p>
-      <w:pPr>
-        <w:spacing w:after="0"/>
-      </w:pPr>
-      <w:r>
-        <w:t xml:space="preserve">- Estructura de archivos y directorios del proyecto </w:t>
-      </w:r>
-    </w:p>
-    <w:p>
-      <w:pPr>
-        <w:spacing w:after="0"/>
-      </w:pPr>
-      <w:r>
         <w:t xml:space="preserve">- Descripción de la base de datos (modelo entidad-relación, tablas, campos) </w:t>
       </w:r>
     </w:p>
     <w:p>
       <w:pPr>
         <w:spacing w:after="0"/>
-      </w:pPr>
-      <w:r>
-        <w:t xml:space="preserve">- Descripción de funcionalidades del backend </w:t>
-      </w:r>
-    </w:p>
-    <w:p>
-      <w:pPr>
-        <w:spacing w:after="0"/>
-      </w:pPr>
-      <w:r>
-        <w:t xml:space="preserve">- Descripción de funcionalidades del frontend </w:t>
-      </w:r>
-    </w:p>
-    <w:p>
-      <w:pPr>
-        <w:spacing w:after="0"/>
-      </w:pPr>
-      <w:r>
-        <w:t xml:space="preserve">- APIs utilizadas (si es necesario) </w:t>
-      </w:r>
-    </w:p>
-    <w:p>
-      <w:pPr>
-        <w:spacing w:after="0"/>
-      </w:pPr>
-      <w:r>
-        <w:t xml:space="preserve">- Librerías y frameworks empleados </w:t>
-      </w:r>
-    </w:p>
-    <w:p>
-      <w:pPr>
-        <w:spacing w:after="0"/>
-      </w:pPr>
-    </w:p>
-    <w:p>
-      <w:pPr>
-        <w:spacing w:after="0"/>
+        <w:rPr>
+          <w:rFonts w:ascii="Verdana" w:hAnsi="Verdana"/>
+        </w:rPr>
+      </w:pPr>
+    </w:p>
+    <w:p>
+      <w:pPr>
+        <w:spacing w:after="0"/>
+        <w:rPr>
+          <w:rFonts w:ascii="Verdana" w:hAnsi="Verdana"/>
+        </w:rPr>
+      </w:pPr>
+      <w:r>
+        <w:rPr>
+          <w:rFonts w:ascii="Verdana" w:hAnsi="Verdana"/>
+        </w:rPr>
+        <w:t xml:space="preserve">- Descripción de funcionalidades del </w:t>
+      </w:r>
+      <w:proofErr w:type="spellStart"/>
+      <w:r>
+        <w:rPr>
+          <w:rFonts w:ascii="Verdana" w:hAnsi="Verdana"/>
+        </w:rPr>
+        <w:t>backend</w:t>
+      </w:r>
+      <w:proofErr w:type="spellEnd"/>
+      <w:r>
+        <w:rPr>
+          <w:rFonts w:ascii="Verdana" w:hAnsi="Verdana"/>
+        </w:rPr>
+        <w:t xml:space="preserve"> </w:t>
+      </w:r>
+    </w:p>
+    <w:p>
+      <w:pPr>
+        <w:spacing w:after="0"/>
+        <w:rPr>
+          <w:rFonts w:ascii="Verdana" w:hAnsi="Verdana"/>
+        </w:rPr>
+      </w:pPr>
+    </w:p>
+    <w:p>
+      <w:pPr>
+        <w:spacing w:after="0"/>
+        <w:rPr>
+          <w:rFonts w:ascii="Verdana" w:hAnsi="Verdana"/>
+        </w:rPr>
+      </w:pPr>
+      <w:r>
+        <w:rPr>
+          <w:rFonts w:ascii="Verdana" w:hAnsi="Verdana"/>
+        </w:rPr>
+        <w:t xml:space="preserve">- Descripción de funcionalidades del </w:t>
+      </w:r>
+      <w:proofErr w:type="spellStart"/>
+      <w:r>
+        <w:rPr>
+          <w:rFonts w:ascii="Verdana" w:hAnsi="Verdana"/>
+        </w:rPr>
+        <w:t>frontend</w:t>
+      </w:r>
+      <w:proofErr w:type="spellEnd"/>
+      <w:r>
+        <w:rPr>
+          <w:rFonts w:ascii="Verdana" w:hAnsi="Verdana"/>
+        </w:rPr>
+        <w:t xml:space="preserve"> </w:t>
+      </w:r>
+    </w:p>
+    <w:p>
+      <w:pPr>
+        <w:spacing w:after="0"/>
+        <w:rPr>
+          <w:rFonts w:ascii="Verdana" w:hAnsi="Verdana"/>
+        </w:rPr>
+      </w:pPr>
+    </w:p>
+    <w:p>
+      <w:pPr>
+        <w:spacing w:after="0"/>
+        <w:rPr>
+          <w:rFonts w:ascii="Verdana" w:hAnsi="Verdana"/>
+        </w:rPr>
+      </w:pPr>
+      <w:r>
+        <w:rPr>
+          <w:rFonts w:ascii="Verdana" w:hAnsi="Verdana"/>
+        </w:rPr>
+        <w:t xml:space="preserve">- </w:t>
+      </w:r>
+      <w:proofErr w:type="spellStart"/>
+      <w:r>
+        <w:rPr>
+          <w:rFonts w:ascii="Verdana" w:hAnsi="Verdana"/>
+        </w:rPr>
+        <w:t>APIs</w:t>
+      </w:r>
+      <w:proofErr w:type="spellEnd"/>
+      <w:r>
+        <w:rPr>
+          <w:rFonts w:ascii="Verdana" w:hAnsi="Verdana"/>
+        </w:rPr>
+        <w:t xml:space="preserve"> utilizadas (si es necesario) </w:t>
+      </w:r>
+    </w:p>
+    <w:p>
+      <w:pPr>
+        <w:spacing w:after="0"/>
+        <w:rPr>
+          <w:rFonts w:ascii="Verdana" w:hAnsi="Verdana"/>
+        </w:rPr>
+      </w:pPr>
+    </w:p>
+    <w:p>
+      <w:pPr>
+        <w:spacing w:after="0"/>
+        <w:rPr>
+          <w:rFonts w:ascii="Verdana" w:hAnsi="Verdana"/>
+        </w:rPr>
+      </w:pPr>
+      <w:r>
+        <w:rPr>
+          <w:rFonts w:ascii="Verdana" w:hAnsi="Verdana"/>
+        </w:rPr>
+        <w:t xml:space="preserve">- Librerías y </w:t>
+      </w:r>
+      <w:proofErr w:type="spellStart"/>
+      <w:r>
+        <w:rPr>
+          <w:rFonts w:ascii="Verdana" w:hAnsi="Verdana"/>
+        </w:rPr>
+        <w:t>frameworks</w:t>
+      </w:r>
+      <w:proofErr w:type="spellEnd"/>
+      <w:r>
+        <w:rPr>
+          <w:rFonts w:ascii="Verdana" w:hAnsi="Verdana"/>
+        </w:rPr>
+        <w:t xml:space="preserve"> empleados </w:t>
+      </w:r>
+    </w:p>
+    <w:p>
+      <w:pPr>
+        <w:spacing w:after="0"/>
+        <w:rPr>
+          <w:rFonts w:ascii="Verdana" w:hAnsi="Verdana"/>
+        </w:rPr>
+      </w:pPr>
+    </w:p>
+    <w:p>
+      <w:pPr>
+        <w:spacing w:after="0"/>
+        <w:rPr>
+          <w:rFonts w:ascii="Verdana" w:hAnsi="Verdana"/>
+        </w:rPr>
+      </w:pPr>
+    </w:p>
+    <w:p>
+      <w:pPr>
+        <w:pStyle w:val="Ttulo1"/>
       </w:pPr>
       <w:r>
         <w:t xml:space="preserve">6. MANUAL DE USUARIO </w:t>
@@ -748,43 +1771,102 @@
     <w:p>
       <w:pPr>
         <w:spacing w:after="0"/>
-      </w:pPr>
-      <w:r>
+        <w:rPr>
+          <w:rFonts w:ascii="Verdana" w:hAnsi="Verdana"/>
+        </w:rPr>
+      </w:pPr>
+      <w:r>
+        <w:rPr>
+          <w:rFonts w:ascii="Verdana" w:hAnsi="Verdana"/>
+        </w:rPr>
         <w:t xml:space="preserve">- Guía paso a paso para utilizar la aplicación </w:t>
       </w:r>
     </w:p>
     <w:p>
       <w:pPr>
         <w:spacing w:after="0"/>
-      </w:pPr>
-      <w:r>
+        <w:rPr>
+          <w:rFonts w:ascii="Verdana" w:hAnsi="Verdana"/>
+        </w:rPr>
+      </w:pPr>
+    </w:p>
+    <w:p>
+      <w:pPr>
+        <w:spacing w:after="0"/>
+        <w:rPr>
+          <w:rFonts w:ascii="Verdana" w:hAnsi="Verdana"/>
+        </w:rPr>
+      </w:pPr>
+      <w:r>
+        <w:rPr>
+          <w:rFonts w:ascii="Verdana" w:hAnsi="Verdana"/>
+        </w:rPr>
         <w:t xml:space="preserve">- Capturas de pantalla de las principales funcionalidades </w:t>
       </w:r>
     </w:p>
     <w:p>
       <w:pPr>
         <w:spacing w:after="0"/>
-      </w:pPr>
-      <w:r>
+        <w:rPr>
+          <w:rFonts w:ascii="Verdana" w:hAnsi="Verdana"/>
+        </w:rPr>
+      </w:pPr>
+    </w:p>
+    <w:p>
+      <w:pPr>
+        <w:spacing w:after="0"/>
+        <w:rPr>
+          <w:rFonts w:ascii="Verdana" w:hAnsi="Verdana"/>
+        </w:rPr>
+      </w:pPr>
+      <w:r>
+        <w:rPr>
+          <w:rFonts w:ascii="Verdana" w:hAnsi="Verdana"/>
+        </w:rPr>
         <w:t xml:space="preserve">- Casos de uso comunes </w:t>
       </w:r>
     </w:p>
     <w:p>
       <w:pPr>
         <w:spacing w:after="0"/>
-      </w:pPr>
-      <w:r>
+        <w:rPr>
+          <w:rFonts w:ascii="Verdana" w:hAnsi="Verdana"/>
+        </w:rPr>
+      </w:pPr>
+    </w:p>
+    <w:p>
+      <w:pPr>
+        <w:spacing w:after="0"/>
+        <w:rPr>
+          <w:rFonts w:ascii="Verdana" w:hAnsi="Verdana"/>
+        </w:rPr>
+      </w:pPr>
+      <w:r>
+        <w:rPr>
+          <w:rFonts w:ascii="Verdana" w:hAnsi="Verdana"/>
+        </w:rPr>
         <w:t xml:space="preserve">- Resolución de problemas frecuentes </w:t>
       </w:r>
     </w:p>
     <w:p>
       <w:pPr>
         <w:spacing w:after="0"/>
-      </w:pPr>
-    </w:p>
-    <w:p>
-      <w:pPr>
-        <w:spacing w:after="0"/>
+        <w:rPr>
+          <w:rFonts w:ascii="Verdana" w:hAnsi="Verdana"/>
+        </w:rPr>
+      </w:pPr>
+    </w:p>
+    <w:p>
+      <w:pPr>
+        <w:spacing w:after="0"/>
+        <w:rPr>
+          <w:rFonts w:ascii="Verdana" w:hAnsi="Verdana"/>
+        </w:rPr>
+      </w:pPr>
+    </w:p>
+    <w:p>
+      <w:pPr>
+        <w:pStyle w:val="Ttulo1"/>
       </w:pPr>
       <w:r>
         <w:t xml:space="preserve">7. CONTROL DE VERSIONES - GIT/GITHUB </w:t>
@@ -793,51 +1875,152 @@
     <w:p>
       <w:pPr>
         <w:spacing w:after="0"/>
-      </w:pPr>
-      <w:r>
+        <w:rPr>
+          <w:rFonts w:ascii="Verdana" w:hAnsi="Verdana"/>
+        </w:rPr>
+      </w:pPr>
+      <w:r>
+        <w:rPr>
+          <w:rFonts w:ascii="Verdana" w:hAnsi="Verdana"/>
+        </w:rPr>
         <w:t xml:space="preserve">- Enlace al repositorio de GitHub del proyecto </w:t>
       </w:r>
     </w:p>
     <w:p>
       <w:pPr>
         <w:spacing w:after="0"/>
-      </w:pPr>
-      <w:r>
-        <w:t>- Explicación de la estructura de commits realizados</w:t>
-      </w:r>
-    </w:p>
-    <w:p>
-      <w:pPr>
-        <w:spacing w:after="0"/>
-      </w:pPr>
-      <w:r>
+        <w:rPr>
+          <w:rFonts w:ascii="Verdana" w:hAnsi="Verdana"/>
+        </w:rPr>
+      </w:pPr>
+    </w:p>
+    <w:p>
+      <w:pPr>
+        <w:spacing w:after="0"/>
+        <w:rPr>
+          <w:rFonts w:ascii="Verdana" w:hAnsi="Verdana"/>
+        </w:rPr>
+      </w:pPr>
+      <w:r>
+        <w:rPr>
+          <w:rFonts w:ascii="Verdana" w:hAnsi="Verdana"/>
+        </w:rPr>
+        <w:t xml:space="preserve">- Explicación de la estructura de </w:t>
+      </w:r>
+      <w:proofErr w:type="spellStart"/>
+      <w:r>
+        <w:rPr>
+          <w:rFonts w:ascii="Verdana" w:hAnsi="Verdana"/>
+        </w:rPr>
+        <w:t>commits</w:t>
+      </w:r>
+      <w:proofErr w:type="spellEnd"/>
+      <w:r>
+        <w:rPr>
+          <w:rFonts w:ascii="Verdana" w:hAnsi="Verdana"/>
+        </w:rPr>
+        <w:t xml:space="preserve"> realizados</w:t>
+      </w:r>
+    </w:p>
+    <w:p>
+      <w:pPr>
+        <w:spacing w:after="0"/>
+        <w:rPr>
+          <w:rFonts w:ascii="Verdana" w:hAnsi="Verdana"/>
+        </w:rPr>
+      </w:pPr>
+    </w:p>
+    <w:p>
+      <w:pPr>
+        <w:spacing w:after="0"/>
+        <w:rPr>
+          <w:rFonts w:ascii="Verdana" w:hAnsi="Verdana"/>
+        </w:rPr>
+      </w:pPr>
+      <w:r>
+        <w:rPr>
+          <w:rFonts w:ascii="Verdana" w:hAnsi="Verdana"/>
+        </w:rPr>
         <w:t xml:space="preserve">- Descripción de las ramas utilizadas (si es necesario) </w:t>
       </w:r>
     </w:p>
     <w:p>
       <w:pPr>
         <w:spacing w:after="0"/>
-      </w:pPr>
-      <w:r>
-        <w:t xml:space="preserve">- Capturas de pantalla del historial de commits </w:t>
-      </w:r>
-    </w:p>
-    <w:p>
-      <w:pPr>
-        <w:spacing w:after="0"/>
-      </w:pPr>
-      <w:r>
+        <w:rPr>
+          <w:rFonts w:ascii="Verdana" w:hAnsi="Verdana"/>
+        </w:rPr>
+      </w:pPr>
+    </w:p>
+    <w:p>
+      <w:pPr>
+        <w:spacing w:after="0"/>
+        <w:rPr>
+          <w:rFonts w:ascii="Verdana" w:hAnsi="Verdana"/>
+        </w:rPr>
+      </w:pPr>
+      <w:r>
+        <w:rPr>
+          <w:rFonts w:ascii="Verdana" w:hAnsi="Verdana"/>
+        </w:rPr>
+        <w:t xml:space="preserve">- Capturas de pantalla del historial de </w:t>
+      </w:r>
+      <w:proofErr w:type="spellStart"/>
+      <w:r>
+        <w:rPr>
+          <w:rFonts w:ascii="Verdana" w:hAnsi="Verdana"/>
+        </w:rPr>
+        <w:t>commits</w:t>
+      </w:r>
+      <w:proofErr w:type="spellEnd"/>
+      <w:r>
+        <w:rPr>
+          <w:rFonts w:ascii="Verdana" w:hAnsi="Verdana"/>
+        </w:rPr>
+        <w:t xml:space="preserve"> </w:t>
+      </w:r>
+    </w:p>
+    <w:p>
+      <w:pPr>
+        <w:spacing w:after="0"/>
+        <w:rPr>
+          <w:rFonts w:ascii="Verdana" w:hAnsi="Verdana"/>
+        </w:rPr>
+      </w:pPr>
+    </w:p>
+    <w:p>
+      <w:pPr>
+        <w:spacing w:after="0"/>
+        <w:rPr>
+          <w:rFonts w:ascii="Verdana" w:hAnsi="Verdana"/>
+        </w:rPr>
+      </w:pPr>
+      <w:r>
+        <w:rPr>
+          <w:rFonts w:ascii="Verdana" w:hAnsi="Verdana"/>
+        </w:rPr>
         <w:t xml:space="preserve">- Justificación del uso de Git en el desarrollo </w:t>
       </w:r>
     </w:p>
     <w:p>
       <w:pPr>
         <w:spacing w:after="0"/>
-      </w:pPr>
-    </w:p>
-    <w:p>
-      <w:pPr>
-        <w:spacing w:after="0"/>
+        <w:rPr>
+          <w:rFonts w:ascii="Verdana" w:hAnsi="Verdana"/>
+        </w:rPr>
+      </w:pPr>
+    </w:p>
+    <w:p>
+      <w:pPr>
+        <w:spacing w:after="0"/>
+        <w:rPr>
+          <w:rFonts w:ascii="Verdana" w:hAnsi="Verdana"/>
+        </w:rPr>
+      </w:pPr>
+    </w:p>
+    <w:p>
+      <w:pPr>
+        <w:pStyle w:val="Ttulo1"/>
       </w:pPr>
       <w:r>
         <w:t xml:space="preserve">8. TESTING Y PRUEBAS </w:t>
@@ -846,35 +2029,80 @@
     <w:p>
       <w:pPr>
         <w:spacing w:after="0"/>
-      </w:pPr>
-      <w:r>
+        <w:rPr>
+          <w:rFonts w:ascii="Verdana" w:hAnsi="Verdana"/>
+        </w:rPr>
+      </w:pPr>
+      <w:r>
+        <w:rPr>
+          <w:rFonts w:ascii="Verdana" w:hAnsi="Verdana"/>
+        </w:rPr>
         <w:t xml:space="preserve">- Pruebas realizadas (funcionales, de usabilidad, de compatibilidad) </w:t>
       </w:r>
     </w:p>
     <w:p>
       <w:pPr>
         <w:spacing w:after="0"/>
-      </w:pPr>
-      <w:r>
+        <w:rPr>
+          <w:rFonts w:ascii="Verdana" w:hAnsi="Verdana"/>
+        </w:rPr>
+      </w:pPr>
+    </w:p>
+    <w:p>
+      <w:pPr>
+        <w:spacing w:after="0"/>
+        <w:rPr>
+          <w:rFonts w:ascii="Verdana" w:hAnsi="Verdana"/>
+        </w:rPr>
+      </w:pPr>
+      <w:r>
+        <w:rPr>
+          <w:rFonts w:ascii="Verdana" w:hAnsi="Verdana"/>
+        </w:rPr>
         <w:t xml:space="preserve">- Resultados de las pruebas </w:t>
       </w:r>
     </w:p>
     <w:p>
       <w:pPr>
         <w:spacing w:after="0"/>
-      </w:pPr>
-      <w:r>
+        <w:rPr>
+          <w:rFonts w:ascii="Verdana" w:hAnsi="Verdana"/>
+        </w:rPr>
+      </w:pPr>
+    </w:p>
+    <w:p>
+      <w:pPr>
+        <w:spacing w:after="0"/>
+        <w:rPr>
+          <w:rFonts w:ascii="Verdana" w:hAnsi="Verdana"/>
+        </w:rPr>
+      </w:pPr>
+      <w:r>
+        <w:rPr>
+          <w:rFonts w:ascii="Verdana" w:hAnsi="Verdana"/>
+        </w:rPr>
         <w:t xml:space="preserve">- Correcciones implementadas </w:t>
       </w:r>
     </w:p>
     <w:p>
       <w:pPr>
         <w:spacing w:after="0"/>
-      </w:pPr>
-    </w:p>
-    <w:p>
-      <w:pPr>
-        <w:spacing w:after="0"/>
+        <w:rPr>
+          <w:rFonts w:ascii="Verdana" w:hAnsi="Verdana"/>
+        </w:rPr>
+      </w:pPr>
+    </w:p>
+    <w:p>
+      <w:pPr>
+        <w:spacing w:after="0"/>
+        <w:rPr>
+          <w:rFonts w:ascii="Verdana" w:hAnsi="Verdana"/>
+        </w:rPr>
+      </w:pPr>
+    </w:p>
+    <w:p>
+      <w:pPr>
+        <w:pStyle w:val="Ttulo1"/>
       </w:pPr>
       <w:r>
         <w:t xml:space="preserve">9. CONCLUSIONES </w:t>
@@ -883,43 +2111,103 @@
     <w:p>
       <w:pPr>
         <w:spacing w:after="0"/>
-      </w:pPr>
-      <w:r>
+        <w:rPr>
+          <w:rFonts w:ascii="Verdana" w:hAnsi="Verdana"/>
+        </w:rPr>
+      </w:pPr>
+      <w:r>
+        <w:rPr>
+          <w:rFonts w:ascii="Verdana" w:hAnsi="Verdana"/>
+        </w:rPr>
         <w:t xml:space="preserve">- Objetivos conseguidos </w:t>
       </w:r>
     </w:p>
     <w:p>
       <w:pPr>
         <w:spacing w:after="0"/>
-      </w:pPr>
-      <w:r>
+        <w:rPr>
+          <w:rFonts w:ascii="Verdana" w:hAnsi="Verdana"/>
+        </w:rPr>
+      </w:pPr>
+    </w:p>
+    <w:p>
+      <w:pPr>
+        <w:spacing w:after="0"/>
+        <w:rPr>
+          <w:rFonts w:ascii="Verdana" w:hAnsi="Verdana"/>
+        </w:rPr>
+      </w:pPr>
+      <w:r>
+        <w:rPr>
+          <w:rFonts w:ascii="Verdana" w:hAnsi="Verdana"/>
+        </w:rPr>
         <w:t xml:space="preserve">- Dificultades encontradas y soluciones aplicadas </w:t>
       </w:r>
     </w:p>
     <w:p>
       <w:pPr>
         <w:spacing w:after="0"/>
-      </w:pPr>
-      <w:r>
+        <w:rPr>
+          <w:rFonts w:ascii="Verdana" w:hAnsi="Verdana"/>
+        </w:rPr>
+      </w:pPr>
+    </w:p>
+    <w:p>
+      <w:pPr>
+        <w:spacing w:after="0"/>
+        <w:rPr>
+          <w:rFonts w:ascii="Verdana" w:hAnsi="Verdana"/>
+        </w:rPr>
+      </w:pPr>
+      <w:r>
+        <w:rPr>
+          <w:rFonts w:ascii="Verdana" w:hAnsi="Verdana"/>
+        </w:rPr>
+        <w:lastRenderedPageBreak/>
         <w:t xml:space="preserve">- Posibles mejoras futuras </w:t>
       </w:r>
     </w:p>
     <w:p>
       <w:pPr>
         <w:spacing w:after="0"/>
-      </w:pPr>
-      <w:r>
+        <w:rPr>
+          <w:rFonts w:ascii="Verdana" w:hAnsi="Verdana"/>
+        </w:rPr>
+      </w:pPr>
+    </w:p>
+    <w:p>
+      <w:pPr>
+        <w:spacing w:after="0"/>
+        <w:rPr>
+          <w:rFonts w:ascii="Verdana" w:hAnsi="Verdana"/>
+        </w:rPr>
+      </w:pPr>
+      <w:r>
+        <w:rPr>
+          <w:rFonts w:ascii="Verdana" w:hAnsi="Verdana"/>
+        </w:rPr>
         <w:t xml:space="preserve">- Valoración personal del proyecto </w:t>
       </w:r>
     </w:p>
     <w:p>
       <w:pPr>
         <w:spacing w:after="0"/>
-      </w:pPr>
-    </w:p>
-    <w:p>
-      <w:pPr>
-        <w:spacing w:after="0"/>
+        <w:rPr>
+          <w:rFonts w:ascii="Verdana" w:hAnsi="Verdana"/>
+        </w:rPr>
+      </w:pPr>
+    </w:p>
+    <w:p>
+      <w:pPr>
+        <w:spacing w:after="0"/>
+        <w:rPr>
+          <w:rFonts w:ascii="Verdana" w:hAnsi="Verdana"/>
+        </w:rPr>
+      </w:pPr>
+    </w:p>
+    <w:p>
+      <w:pPr>
+        <w:pStyle w:val="Ttulo1"/>
       </w:pPr>
       <w:r>
         <w:t xml:space="preserve">10. BIBLIOGRAFÍA Y WEBGRAFÍA </w:t>
@@ -928,35 +2216,80 @@
     <w:p>
       <w:pPr>
         <w:spacing w:after="0"/>
-      </w:pPr>
-      <w:r>
+        <w:rPr>
+          <w:rFonts w:ascii="Verdana" w:hAnsi="Verdana"/>
+        </w:rPr>
+      </w:pPr>
+      <w:r>
+        <w:rPr>
+          <w:rFonts w:ascii="Verdana" w:hAnsi="Verdana"/>
+        </w:rPr>
         <w:t xml:space="preserve">- Referencias utilizadas (libros, artículos, tutoriales) </w:t>
       </w:r>
     </w:p>
     <w:p>
       <w:pPr>
         <w:spacing w:after="0"/>
-      </w:pPr>
-      <w:r>
+        <w:rPr>
+          <w:rFonts w:ascii="Verdana" w:hAnsi="Verdana"/>
+        </w:rPr>
+      </w:pPr>
+    </w:p>
+    <w:p>
+      <w:pPr>
+        <w:spacing w:after="0"/>
+        <w:rPr>
+          <w:rFonts w:ascii="Verdana" w:hAnsi="Verdana"/>
+        </w:rPr>
+      </w:pPr>
+      <w:r>
+        <w:rPr>
+          <w:rFonts w:ascii="Verdana" w:hAnsi="Verdana"/>
+        </w:rPr>
         <w:t xml:space="preserve">- Recursos web consultados </w:t>
       </w:r>
     </w:p>
     <w:p>
       <w:pPr>
         <w:spacing w:after="0"/>
-      </w:pPr>
-      <w:r>
+        <w:rPr>
+          <w:rFonts w:ascii="Verdana" w:hAnsi="Verdana"/>
+        </w:rPr>
+      </w:pPr>
+    </w:p>
+    <w:p>
+      <w:pPr>
+        <w:spacing w:after="0"/>
+        <w:rPr>
+          <w:rFonts w:ascii="Verdana" w:hAnsi="Verdana"/>
+        </w:rPr>
+      </w:pPr>
+      <w:r>
+        <w:rPr>
+          <w:rFonts w:ascii="Verdana" w:hAnsi="Verdana"/>
+        </w:rPr>
         <w:t xml:space="preserve">- Formato de citación consistente </w:t>
       </w:r>
     </w:p>
     <w:p>
       <w:pPr>
         <w:spacing w:after="0"/>
-      </w:pPr>
-    </w:p>
-    <w:p>
-      <w:pPr>
-        <w:spacing w:after="0"/>
+        <w:rPr>
+          <w:rFonts w:ascii="Verdana" w:hAnsi="Verdana"/>
+        </w:rPr>
+      </w:pPr>
+    </w:p>
+    <w:p>
+      <w:pPr>
+        <w:spacing w:after="0"/>
+        <w:rPr>
+          <w:rFonts w:ascii="Verdana" w:hAnsi="Verdana"/>
+        </w:rPr>
+      </w:pPr>
+    </w:p>
+    <w:p>
+      <w:pPr>
+        <w:pStyle w:val="Ttulo1"/>
       </w:pPr>
       <w:r>
         <w:t xml:space="preserve">ANEXOS (si aplica) </w:t>
@@ -965,24 +2298,58 @@
     <w:p>
       <w:pPr>
         <w:spacing w:after="0"/>
-      </w:pPr>
-      <w:r>
+        <w:rPr>
+          <w:rFonts w:ascii="Verdana" w:hAnsi="Verdana"/>
+        </w:rPr>
+      </w:pPr>
+      <w:r>
+        <w:rPr>
+          <w:rFonts w:ascii="Verdana" w:hAnsi="Verdana"/>
+        </w:rPr>
         <w:t xml:space="preserve">- Código fuente relevante </w:t>
       </w:r>
     </w:p>
     <w:p>
       <w:pPr>
         <w:spacing w:after="0"/>
-      </w:pPr>
-      <w:r>
+        <w:rPr>
+          <w:rFonts w:ascii="Verdana" w:hAnsi="Verdana"/>
+        </w:rPr>
+      </w:pPr>
+    </w:p>
+    <w:p>
+      <w:pPr>
+        <w:spacing w:after="0"/>
+        <w:rPr>
+          <w:rFonts w:ascii="Verdana" w:hAnsi="Verdana"/>
+        </w:rPr>
+      </w:pPr>
+      <w:r>
+        <w:rPr>
+          <w:rFonts w:ascii="Verdana" w:hAnsi="Verdana"/>
+        </w:rPr>
         <w:t xml:space="preserve">- Encuestas o entrevistas realizadas </w:t>
       </w:r>
     </w:p>
     <w:p>
       <w:pPr>
         <w:spacing w:after="0"/>
-      </w:pPr>
-      <w:r>
+        <w:rPr>
+          <w:rFonts w:ascii="Verdana" w:hAnsi="Verdana"/>
+        </w:rPr>
+      </w:pPr>
+    </w:p>
+    <w:p>
+      <w:pPr>
+        <w:spacing w:after="0"/>
+        <w:rPr>
+          <w:rFonts w:ascii="Verdana" w:hAnsi="Verdana"/>
+        </w:rPr>
+      </w:pPr>
+      <w:r>
+        <w:rPr>
+          <w:rFonts w:ascii="Verdana" w:hAnsi="Verdana"/>
+        </w:rPr>
         <w:t>- Documentación adicional</w:t>
       </w:r>
     </w:p>
@@ -1395,6 +2762,51 @@
     <w:name w:val="Normal"/>
     <w:qFormat/>
   </w:style>
+  <w:style w:type="paragraph" w:styleId="Ttulo1">
+    <w:name w:val="heading 1"/>
+    <w:basedOn w:val="Normal"/>
+    <w:next w:val="Normal"/>
+    <w:link w:val="Ttulo1Car"/>
+    <w:uiPriority w:val="9"/>
+    <w:qFormat/>
+    <w:rsid w:val="008D568F"/>
+    <w:pPr>
+      <w:keepNext/>
+      <w:keepLines/>
+      <w:spacing w:after="0"/>
+      <w:outlineLvl w:val="0"/>
+    </w:pPr>
+    <w:rPr>
+      <w:rFonts w:ascii="Verdana" w:eastAsiaTheme="majorEastAsia" w:hAnsi="Verdana" w:cstheme="majorBidi"/>
+      <w:b/>
+      <w:sz w:val="32"/>
+      <w:szCs w:val="32"/>
+      <w:u w:val="single"/>
+    </w:rPr>
+  </w:style>
+  <w:style w:type="paragraph" w:styleId="Ttulo2">
+    <w:name w:val="heading 2"/>
+    <w:basedOn w:val="Normal"/>
+    <w:next w:val="Normal"/>
+    <w:link w:val="Ttulo2Car"/>
+    <w:uiPriority w:val="9"/>
+    <w:unhideWhenUsed/>
+    <w:qFormat/>
+    <w:rsid w:val="008D568F"/>
+    <w:pPr>
+      <w:keepNext/>
+      <w:keepLines/>
+      <w:spacing w:after="0"/>
+      <w:outlineLvl w:val="1"/>
+    </w:pPr>
+    <w:rPr>
+      <w:rFonts w:asciiTheme="majorHAnsi" w:eastAsiaTheme="majorEastAsia" w:hAnsiTheme="majorHAnsi" w:cstheme="majorBidi"/>
+      <w:b/>
+      <w:sz w:val="26"/>
+      <w:szCs w:val="26"/>
+      <w:u w:val="single"/>
+    </w:rPr>
+  </w:style>
   <w:style w:type="character" w:default="1" w:styleId="Fuentedeprrafopredeter">
     <w:name w:val="Default Paragraph Font"/>
     <w:uiPriority w:val="1"/>
@@ -1421,6 +2833,34 @@
     <w:uiPriority w:val="99"/>
     <w:semiHidden/>
     <w:unhideWhenUsed/>
+  </w:style>
+  <w:style w:type="character" w:customStyle="1" w:styleId="Ttulo1Car">
+    <w:name w:val="Título 1 Car"/>
+    <w:basedOn w:val="Fuentedeprrafopredeter"/>
+    <w:link w:val="Ttulo1"/>
+    <w:uiPriority w:val="9"/>
+    <w:rsid w:val="008D568F"/>
+    <w:rPr>
+      <w:rFonts w:ascii="Verdana" w:eastAsiaTheme="majorEastAsia" w:hAnsi="Verdana" w:cstheme="majorBidi"/>
+      <w:b/>
+      <w:sz w:val="32"/>
+      <w:szCs w:val="32"/>
+      <w:u w:val="single"/>
+    </w:rPr>
+  </w:style>
+  <w:style w:type="character" w:customStyle="1" w:styleId="Ttulo2Car">
+    <w:name w:val="Título 2 Car"/>
+    <w:basedOn w:val="Fuentedeprrafopredeter"/>
+    <w:link w:val="Ttulo2"/>
+    <w:uiPriority w:val="9"/>
+    <w:rsid w:val="008D568F"/>
+    <w:rPr>
+      <w:rFonts w:asciiTheme="majorHAnsi" w:eastAsiaTheme="majorEastAsia" w:hAnsiTheme="majorHAnsi" w:cstheme="majorBidi"/>
+      <w:b/>
+      <w:sz w:val="26"/>
+      <w:szCs w:val="26"/>
+      <w:u w:val="single"/>
+    </w:rPr>
   </w:style>
 </w:styles>
 </file>

</xml_diff>